<commit_message>
Migrate client to async httpx
</commit_message>
<xml_diff>
--- a/docs/tripmate-forest-map-data.docx
+++ b/docs/tripmate-forest-map-data.docx
@@ -4,130 +4,126 @@
   <w:body>
     <w:p>
       <w:pPr>
+        <w:spacing w:after="80"/>
         <w:jc w:val="center"/>
       </w:pPr>
       <w:r>
         <w:rPr>
-          <w:rFonts w:ascii="Noto Sans KR" w:hAnsi="Noto Sans KR" w:eastAsia="Noto Sans KR"/>
+          <w:rFonts w:ascii="Malgun Gothic" w:hAnsi="Malgun Gothic" w:eastAsia="Malgun Gothic"/>
           <w:b/>
-          <w:color w:val="165242"/>
+          <w:color w:val="1B5642"/>
           <w:sz w:val="38"/>
         </w:rPr>
-        <w:t>Tripmate 산림복지·산림재난 지도 데이터 메모</w:t>
+        <w:t>TripMate 산림복지·산림재난 여행지도 활용 메모</w:t>
       </w:r>
     </w:p>
     <w:p>
+      <w:pPr>
+        <w:spacing w:after="240"/>
+        <w:jc w:val="center"/>
+      </w:pPr>
       <w:r>
         <w:rPr>
-          <w:rFonts w:ascii="Noto Sans KR" w:hAnsi="Noto Sans KR" w:eastAsia="Noto Sans KR"/>
+          <w:rFonts w:ascii="Malgun Gothic" w:hAnsi="Malgun Gothic" w:eastAsia="Malgun Gothic"/>
+          <w:b w:val="0"/>
+          <w:color w:val="5A5A5A"/>
           <w:sz w:val="20"/>
         </w:rPr>
-        <w:t>검토일: 2026-05-17</w:t>
+        <w:t>검토일: 2026-05-19</w:t>
+      </w:r>
+    </w:p>
+    <w:p>
+      <w:pPr>
+        <w:spacing w:line="293" w:lineRule="auto" w:after="100"/>
+      </w:pPr>
+      <w:r>
+        <w:rPr>
+          <w:rFonts w:ascii="Malgun Gothic" w:hAnsi="Malgun Gothic" w:eastAsia="Malgun Gothic"/>
+          <w:b w:val="0"/>
+          <w:sz w:val="20"/>
+        </w:rPr>
+        <w:t>TripMate 여행지도 앱에서 산림청 공공데이터를 단순 POI 목록이 아니라 방문 결정을 돕는 현장 정보 레이어로 쓰기 위한 적용안을 정리한다. python-krforest-api는 httpx/asyncio 기반 클라이언트로 전환되어, TripMate 쪽에서는 공개 async API를 직접 사용하는 형태가 적합하다.</w:t>
       </w:r>
     </w:p>
     <w:p>
       <w:pPr>
         <w:pStyle w:val="Heading1"/>
+        <w:spacing w:before="240" w:after="100"/>
       </w:pPr>
       <w:r>
-        <w:t>목적</w:t>
-      </w:r>
-    </w:p>
-    <w:p>
-      <w:r>
         <w:rPr>
-          <w:rFonts w:ascii="Noto Sans KR" w:hAnsi="Noto Sans KR" w:eastAsia="Noto Sans KR"/>
-          <w:sz w:val="20"/>
+          <w:rFonts w:ascii="Malgun Gothic" w:hAnsi="Malgun Gothic" w:eastAsia="Malgun Gothic"/>
+          <w:b/>
+          <w:color w:val="1F4E3D"/>
+          <w:sz w:val="30"/>
         </w:rPr>
-        <w:t>Tripmate 여행지도 앱에서 산림청 공개데이터를 쓸 때, 단순 POI 목록보다 중요한 것은</w:t>
-      </w:r>
-    </w:p>
-    <w:p>
-      <w:r>
-        <w:rPr>
-          <w:rFonts w:ascii="Noto Sans KR" w:hAnsi="Noto Sans KR" w:eastAsia="Noto Sans KR"/>
-          <w:sz w:val="20"/>
-        </w:rPr>
-        <w:t>방문 결정을 돕는 레이어와 현장 안전 신호다. python-krforest-api는 여행·안전에</w:t>
-      </w:r>
-    </w:p>
-    <w:p>
-      <w:r>
-        <w:rPr>
-          <w:rFonts w:ascii="Noto Sans KR" w:hAnsi="Noto Sans KR" w:eastAsia="Noto Sans KR"/>
-          <w:sz w:val="20"/>
-        </w:rPr>
-        <w:t>직접 도움이 되는 산림복지와 산림재난 데이터를 우선 연결하고, 생물 표본·임업경제·</w:t>
-      </w:r>
-    </w:p>
-    <w:p>
-      <w:r>
-        <w:rPr>
-          <w:rFonts w:ascii="Noto Sans KR" w:hAnsi="Noto Sans KR" w:eastAsia="Noto Sans KR"/>
-          <w:sz w:val="20"/>
-        </w:rPr>
-        <w:t>행정통계처럼 여행지도와 거리가 먼 데이터는 제외한다.</w:t>
-      </w:r>
-    </w:p>
-    <w:p>
-      <w:pPr>
-        <w:pStyle w:val="Heading1"/>
-      </w:pPr>
-      <w:r>
-        <w:t>바로 쓸 수 있는 앱 레이어</w:t>
+        <w:t>바로 활용 가능한 데이터</w:t>
       </w:r>
     </w:p>
     <w:tbl>
       <w:tblPr>
         <w:tblStyle w:val="TableGrid"/>
         <w:tblW w:type="auto" w:w="0"/>
+        <w:jc w:val="center"/>
         <w:tblLook w:firstColumn="1" w:firstRow="1" w:lastColumn="0" w:lastRow="0" w:noHBand="0" w:noVBand="1" w:val="04A0"/>
       </w:tblPr>
       <w:tblGrid>
-        <w:gridCol w:w="2556"/>
-        <w:gridCol w:w="2556"/>
-        <w:gridCol w:w="2556"/>
-        <w:gridCol w:w="2556"/>
+        <w:gridCol w:w="2564"/>
+        <w:gridCol w:w="2564"/>
+        <w:gridCol w:w="2564"/>
+        <w:gridCol w:w="2564"/>
       </w:tblGrid>
       <w:tr>
         <w:tc>
           <w:tcPr>
-            <w:tcW w:type="dxa" w:w="2556"/>
+            <w:tcW w:type="dxa" w:w="1219"/>
+            <w:shd w:fill="DCEADF"/>
             <w:vAlign w:val="center"/>
-            <w:shd w:fill="1F4E40"/>
+            <w:tcMar>
+              <w:top w:w="90" w:type="dxa"/>
+              <w:start w:w="90" w:type="dxa"/>
+              <w:bottom w:w="90" w:type="dxa"/>
+              <w:end w:w="90" w:type="dxa"/>
+            </w:tcMar>
           </w:tcPr>
           <w:p>
             <w:pPr>
-              <w:spacing w:after="0"/>
+              <w:spacing w:after="0" w:line="269" w:lineRule="auto"/>
             </w:pPr>
             <w:r/>
             <w:r>
               <w:rPr>
-                <w:rFonts w:ascii="Noto Sans KR" w:hAnsi="Noto Sans KR" w:eastAsia="Noto Sans KR"/>
+                <w:rFonts w:ascii="Malgun Gothic" w:hAnsi="Malgun Gothic" w:eastAsia="Malgun Gothic"/>
                 <w:b/>
-                <w:color w:val="FFFFFF"/>
+                <w:color w:val="1F4E3D"/>
                 <w:sz w:val="17"/>
               </w:rPr>
-              <w:t>앱 레이어</w:t>
+              <w:t>축</w:t>
             </w:r>
           </w:p>
         </w:tc>
         <w:tc>
           <w:tcPr>
-            <w:tcW w:type="dxa" w:w="2556"/>
+            <w:tcW w:type="dxa" w:w="2409"/>
+            <w:shd w:fill="DCEADF"/>
             <w:vAlign w:val="center"/>
-            <w:shd w:fill="1F4E40"/>
+            <w:tcMar>
+              <w:top w:w="90" w:type="dxa"/>
+              <w:start w:w="90" w:type="dxa"/>
+              <w:bottom w:w="90" w:type="dxa"/>
+              <w:end w:w="90" w:type="dxa"/>
+            </w:tcMar>
           </w:tcPr>
           <w:p>
             <w:pPr>
-              <w:spacing w:after="0"/>
+              <w:spacing w:after="0" w:line="269" w:lineRule="auto"/>
             </w:pPr>
             <w:r/>
             <w:r>
               <w:rPr>
-                <w:rFonts w:ascii="Noto Sans KR" w:hAnsi="Noto Sans KR" w:eastAsia="Noto Sans KR"/>
+                <w:rFonts w:ascii="Malgun Gothic" w:hAnsi="Malgun Gothic" w:eastAsia="Malgun Gothic"/>
                 <w:b/>
-                <w:color w:val="FFFFFF"/>
+                <w:color w:val="1F4E3D"/>
                 <w:sz w:val="17"/>
               </w:rPr>
               <w:t>데이터</w:t>
@@ -136,20 +132,26 @@
         </w:tc>
         <w:tc>
           <w:tcPr>
-            <w:tcW w:type="dxa" w:w="2556"/>
+            <w:tcW w:type="dxa" w:w="2863"/>
+            <w:shd w:fill="DCEADF"/>
             <w:vAlign w:val="center"/>
-            <w:shd w:fill="1F4E40"/>
+            <w:tcMar>
+              <w:top w:w="90" w:type="dxa"/>
+              <w:start w:w="90" w:type="dxa"/>
+              <w:bottom w:w="90" w:type="dxa"/>
+              <w:end w:w="90" w:type="dxa"/>
+            </w:tcMar>
           </w:tcPr>
           <w:p>
             <w:pPr>
-              <w:spacing w:after="0"/>
+              <w:spacing w:after="0" w:line="269" w:lineRule="auto"/>
             </w:pPr>
             <w:r/>
             <w:r>
               <w:rPr>
-                <w:rFonts w:ascii="Noto Sans KR" w:hAnsi="Noto Sans KR" w:eastAsia="Noto Sans KR"/>
+                <w:rFonts w:ascii="Malgun Gothic" w:hAnsi="Malgun Gothic" w:eastAsia="Malgun Gothic"/>
                 <w:b/>
-                <w:color w:val="FFFFFF"/>
+                <w:color w:val="1F4E3D"/>
                 <w:sz w:val="17"/>
               </w:rPr>
               <w:t>구현 경로</w:t>
@@ -158,23 +160,29 @@
         </w:tc>
         <w:tc>
           <w:tcPr>
-            <w:tcW w:type="dxa" w:w="2556"/>
+            <w:tcW w:type="dxa" w:w="2863"/>
+            <w:shd w:fill="DCEADF"/>
             <w:vAlign w:val="center"/>
-            <w:shd w:fill="1F4E40"/>
+            <w:tcMar>
+              <w:top w:w="90" w:type="dxa"/>
+              <w:start w:w="90" w:type="dxa"/>
+              <w:bottom w:w="90" w:type="dxa"/>
+              <w:end w:w="90" w:type="dxa"/>
+            </w:tcMar>
           </w:tcPr>
           <w:p>
             <w:pPr>
-              <w:spacing w:after="0"/>
+              <w:spacing w:after="0" w:line="269" w:lineRule="auto"/>
             </w:pPr>
             <w:r/>
             <w:r>
               <w:rPr>
-                <w:rFonts w:ascii="Noto Sans KR" w:hAnsi="Noto Sans KR" w:eastAsia="Noto Sans KR"/>
+                <w:rFonts w:ascii="Malgun Gothic" w:hAnsi="Malgun Gothic" w:eastAsia="Malgun Gothic"/>
                 <w:b/>
-                <w:color w:val="FFFFFF"/>
+                <w:color w:val="1F4E3D"/>
                 <w:sz w:val="17"/>
               </w:rPr>
-              <w:t>활용</w:t>
+              <w:t>여행지도 활용</w:t>
             </w:r>
           </w:p>
         </w:tc>
@@ -182,20 +190,25 @@
       <w:tr>
         <w:tc>
           <w:tcPr>
-            <w:tcW w:type="dxa" w:w="2556"/>
+            <w:tcW w:type="dxa" w:w="1219"/>
             <w:vAlign w:val="center"/>
-            <w:shd w:fill="EAF3EF"/>
+            <w:tcMar>
+              <w:top w:w="90" w:type="dxa"/>
+              <w:start w:w="90" w:type="dxa"/>
+              <w:bottom w:w="90" w:type="dxa"/>
+              <w:end w:w="90" w:type="dxa"/>
+            </w:tcMar>
           </w:tcPr>
           <w:p>
             <w:pPr>
-              <w:spacing w:after="0"/>
+              <w:spacing w:after="0" w:line="269" w:lineRule="auto"/>
             </w:pPr>
             <w:r/>
             <w:r>
               <w:rPr>
-                <w:rFonts w:ascii="Noto Sans KR" w:hAnsi="Noto Sans KR" w:eastAsia="Noto Sans KR"/>
+                <w:rFonts w:ascii="Malgun Gothic" w:hAnsi="Malgun Gothic" w:eastAsia="Malgun Gothic"/>
                 <w:b w:val="0"/>
-                <w:sz w:val="17"/>
+                <w:sz w:val="16"/>
               </w:rPr>
               <w:t>산악기상</w:t>
             </w:r>
@@ -203,61 +216,79 @@
         </w:tc>
         <w:tc>
           <w:tcPr>
-            <w:tcW w:type="dxa" w:w="2556"/>
+            <w:tcW w:type="dxa" w:w="2409"/>
             <w:vAlign w:val="center"/>
+            <w:tcMar>
+              <w:top w:w="90" w:type="dxa"/>
+              <w:start w:w="90" w:type="dxa"/>
+              <w:bottom w:w="90" w:type="dxa"/>
+              <w:end w:w="90" w:type="dxa"/>
+            </w:tcMar>
           </w:tcPr>
           <w:p>
             <w:pPr>
-              <w:spacing w:after="0"/>
+              <w:spacing w:after="0" w:line="269" w:lineRule="auto"/>
             </w:pPr>
             <w:r/>
             <w:r>
               <w:rPr>
-                <w:rFonts w:ascii="Noto Sans KR" w:hAnsi="Noto Sans KR" w:eastAsia="Noto Sans KR"/>
+                <w:rFonts w:ascii="Malgun Gothic" w:hAnsi="Malgun Gothic" w:eastAsia="Malgun Gothic"/>
                 <w:b w:val="0"/>
-                <w:sz w:val="17"/>
+                <w:sz w:val="16"/>
               </w:rPr>
-              <w:t>산림청 국립산림과학원_산악기상정보</w:t>
+              <w:t>산림청 국립산림과학원 산악기상정보</w:t>
             </w:r>
           </w:p>
         </w:tc>
         <w:tc>
           <w:tcPr>
-            <w:tcW w:type="dxa" w:w="2556"/>
+            <w:tcW w:type="dxa" w:w="2863"/>
             <w:vAlign w:val="center"/>
+            <w:tcMar>
+              <w:top w:w="90" w:type="dxa"/>
+              <w:start w:w="90" w:type="dxa"/>
+              <w:bottom w:w="90" w:type="dxa"/>
+              <w:end w:w="90" w:type="dxa"/>
+            </w:tcMar>
           </w:tcPr>
           <w:p>
             <w:pPr>
-              <w:spacing w:after="0"/>
+              <w:spacing w:after="0" w:line="269" w:lineRule="auto"/>
             </w:pPr>
             <w:r/>
             <w:r>
               <w:rPr>
-                <w:rFonts w:ascii="Noto Sans KR" w:hAnsi="Noto Sans KR" w:eastAsia="Noto Sans KR"/>
+                <w:rFonts w:ascii="Malgun Gothic" w:hAnsi="Malgun Gothic" w:eastAsia="Malgun Gothic"/>
                 <w:b w:val="0"/>
-                <w:sz w:val="17"/>
+                <w:sz w:val="16"/>
               </w:rPr>
-              <w:t>client.travel.mountain_weather()</w:t>
+              <w:t>travel.mountain_weather()</w:t>
             </w:r>
           </w:p>
         </w:tc>
         <w:tc>
           <w:tcPr>
-            <w:tcW w:type="dxa" w:w="2556"/>
+            <w:tcW w:type="dxa" w:w="2863"/>
             <w:vAlign w:val="center"/>
+            <w:tcMar>
+              <w:top w:w="90" w:type="dxa"/>
+              <w:start w:w="90" w:type="dxa"/>
+              <w:bottom w:w="90" w:type="dxa"/>
+              <w:end w:w="90" w:type="dxa"/>
+            </w:tcMar>
           </w:tcPr>
           <w:p>
             <w:pPr>
-              <w:spacing w:after="0"/>
+              <w:spacing w:after="0" w:line="269" w:lineRule="auto"/>
             </w:pPr>
             <w:r/>
             <w:r>
               <w:rPr>
-                <w:rFonts w:ascii="Noto Sans KR" w:hAnsi="Noto Sans KR" w:eastAsia="Noto Sans KR"/>
+                <w:rFonts w:ascii="Malgun Gothic" w:hAnsi="Malgun Gothic" w:eastAsia="Malgun Gothic"/>
                 <w:b w:val="0"/>
-                <w:sz w:val="17"/>
+                <w:sz w:val="16"/>
               </w:rPr>
-              <w:t>산행 전 기온, 습도, 풍속, 강수량, 지면온도 확인</w:t>
+              <w:t>산행 전 기온, 습도, 풍속, 강수량, 지면온도 상태 카드</w:t>
             </w:r>
           </w:p>
         </w:tc>
@@ -265,20 +296,25 @@
       <w:tr>
         <w:tc>
           <w:tcPr>
-            <w:tcW w:type="dxa" w:w="2556"/>
+            <w:tcW w:type="dxa" w:w="1219"/>
             <w:vAlign w:val="center"/>
-            <w:shd w:fill="EAF3EF"/>
+            <w:tcMar>
+              <w:top w:w="90" w:type="dxa"/>
+              <w:start w:w="90" w:type="dxa"/>
+              <w:bottom w:w="90" w:type="dxa"/>
+              <w:end w:w="90" w:type="dxa"/>
+            </w:tcMar>
           </w:tcPr>
           <w:p>
             <w:pPr>
-              <w:spacing w:after="0"/>
+              <w:spacing w:after="0" w:line="269" w:lineRule="auto"/>
             </w:pPr>
             <w:r/>
             <w:r>
               <w:rPr>
-                <w:rFonts w:ascii="Noto Sans KR" w:hAnsi="Noto Sans KR" w:eastAsia="Noto Sans KR"/>
+                <w:rFonts w:ascii="Malgun Gothic" w:hAnsi="Malgun Gothic" w:eastAsia="Malgun Gothic"/>
                 <w:b w:val="0"/>
-                <w:sz w:val="17"/>
+                <w:sz w:val="16"/>
               </w:rPr>
               <w:t>등산로</w:t>
             </w:r>
@@ -286,19 +322,25 @@
         </w:tc>
         <w:tc>
           <w:tcPr>
-            <w:tcW w:type="dxa" w:w="2556"/>
+            <w:tcW w:type="dxa" w:w="2409"/>
             <w:vAlign w:val="center"/>
+            <w:tcMar>
+              <w:top w:w="90" w:type="dxa"/>
+              <w:start w:w="90" w:type="dxa"/>
+              <w:bottom w:w="90" w:type="dxa"/>
+              <w:end w:w="90" w:type="dxa"/>
+            </w:tcMar>
           </w:tcPr>
           <w:p>
             <w:pPr>
-              <w:spacing w:after="0"/>
+              <w:spacing w:after="0" w:line="269" w:lineRule="auto"/>
             </w:pPr>
             <w:r/>
             <w:r>
               <w:rPr>
-                <w:rFonts w:ascii="Noto Sans KR" w:hAnsi="Noto Sans KR" w:eastAsia="Noto Sans KR"/>
+                <w:rFonts w:ascii="Malgun Gothic" w:hAnsi="Malgun Gothic" w:eastAsia="Malgun Gothic"/>
                 <w:b w:val="0"/>
-                <w:sz w:val="17"/>
+                <w:sz w:val="16"/>
               </w:rPr>
               <w:t>등산로정보 ZIP, 등산로 OpenAPI</w:t>
             </w:r>
@@ -306,41 +348,66 @@
         </w:tc>
         <w:tc>
           <w:tcPr>
-            <w:tcW w:type="dxa" w:w="2556"/>
+            <w:tcW w:type="dxa" w:w="2863"/>
             <w:vAlign w:val="center"/>
+            <w:tcMar>
+              <w:top w:w="90" w:type="dxa"/>
+              <w:start w:w="90" w:type="dxa"/>
+              <w:bottom w:w="90" w:type="dxa"/>
+              <w:end w:w="90" w:type="dxa"/>
+            </w:tcMar>
           </w:tcPr>
           <w:p>
             <w:pPr>
-              <w:spacing w:after="0"/>
+              <w:spacing w:after="0" w:line="269" w:lineRule="auto"/>
             </w:pPr>
             <w:r/>
             <w:r>
               <w:rPr>
-                <w:rFonts w:ascii="Noto Sans KR" w:hAnsi="Noto Sans KR" w:eastAsia="Noto Sans KR"/>
+                <w:rFonts w:ascii="Malgun Gothic" w:hAnsi="Malgun Gothic" w:eastAsia="Malgun Gothic"/>
                 <w:b w:val="0"/>
-                <w:sz w:val="17"/>
+                <w:sz w:val="16"/>
               </w:rPr>
-              <w:t>client.travel.forest_trail_file_features(), client.travel.forest_spatial_trails()</w:t>
+              <w:t>travel.forest_trail_file_features()</w:t>
+            </w:r>
+          </w:p>
+          <w:p>
+            <w:pPr>
+              <w:spacing w:after="0" w:line="269" w:lineRule="auto"/>
+            </w:pPr>
+            <w:r>
+              <w:rPr>
+                <w:rFonts w:ascii="Malgun Gothic" w:hAnsi="Malgun Gothic" w:eastAsia="Malgun Gothic"/>
+                <w:b w:val="0"/>
+                <w:sz w:val="16"/>
+              </w:rPr>
+              <w:t>travel.forest_spatial_trails()</w:t>
             </w:r>
           </w:p>
         </w:tc>
         <w:tc>
           <w:tcPr>
-            <w:tcW w:type="dxa" w:w="2556"/>
+            <w:tcW w:type="dxa" w:w="2863"/>
             <w:vAlign w:val="center"/>
+            <w:tcMar>
+              <w:top w:w="90" w:type="dxa"/>
+              <w:start w:w="90" w:type="dxa"/>
+              <w:bottom w:w="90" w:type="dxa"/>
+              <w:end w:w="90" w:type="dxa"/>
+            </w:tcMar>
           </w:tcPr>
           <w:p>
             <w:pPr>
-              <w:spacing w:after="0"/>
+              <w:spacing w:after="0" w:line="269" w:lineRule="auto"/>
             </w:pPr>
             <w:r/>
             <w:r>
               <w:rPr>
-                <w:rFonts w:ascii="Noto Sans KR" w:hAnsi="Noto Sans KR" w:eastAsia="Noto Sans KR"/>
+                <w:rFonts w:ascii="Malgun Gothic" w:hAnsi="Malgun Gothic" w:eastAsia="Malgun Gothic"/>
                 <w:b w:val="0"/>
-                <w:sz w:val="17"/>
+                <w:sz w:val="16"/>
               </w:rPr>
-              <w:t>지도 위 등산로 geometry, 산 이름, 위치 노출</w:t>
+              <w:t>지도 위 등산로 geometry, 코스명, 주변 POI 연결</w:t>
             </w:r>
           </w:p>
         </w:tc>
@@ -348,82 +415,118 @@
       <w:tr>
         <w:tc>
           <w:tcPr>
-            <w:tcW w:type="dxa" w:w="2556"/>
+            <w:tcW w:type="dxa" w:w="1219"/>
             <w:vAlign w:val="center"/>
-            <w:shd w:fill="EAF3EF"/>
+            <w:tcMar>
+              <w:top w:w="90" w:type="dxa"/>
+              <w:start w:w="90" w:type="dxa"/>
+              <w:bottom w:w="90" w:type="dxa"/>
+              <w:end w:w="90" w:type="dxa"/>
+            </w:tcMar>
           </w:tcPr>
           <w:p>
             <w:pPr>
-              <w:spacing w:after="0"/>
+              <w:spacing w:after="0" w:line="269" w:lineRule="auto"/>
             </w:pPr>
             <w:r/>
             <w:r>
               <w:rPr>
-                <w:rFonts w:ascii="Noto Sans KR" w:hAnsi="Noto Sans KR" w:eastAsia="Noto Sans KR"/>
+                <w:rFonts w:ascii="Malgun Gothic" w:hAnsi="Malgun Gothic" w:eastAsia="Malgun Gothic"/>
                 <w:b w:val="0"/>
-                <w:sz w:val="17"/>
+                <w:sz w:val="16"/>
               </w:rPr>
-              <w:t>숲길·둘레길</w:t>
+              <w:t>둘레길</w:t>
             </w:r>
           </w:p>
         </w:tc>
         <w:tc>
           <w:tcPr>
-            <w:tcW w:type="dxa" w:w="2556"/>
+            <w:tcW w:type="dxa" w:w="2409"/>
             <w:vAlign w:val="center"/>
+            <w:tcMar>
+              <w:top w:w="90" w:type="dxa"/>
+              <w:start w:w="90" w:type="dxa"/>
+              <w:bottom w:w="90" w:type="dxa"/>
+              <w:end w:w="90" w:type="dxa"/>
+            </w:tcMar>
           </w:tcPr>
           <w:p>
             <w:pPr>
-              <w:spacing w:after="0"/>
+              <w:spacing w:after="0" w:line="269" w:lineRule="auto"/>
             </w:pPr>
             <w:r/>
             <w:r>
               <w:rPr>
-                <w:rFonts w:ascii="Noto Sans KR" w:hAnsi="Noto Sans KR" w:eastAsia="Noto Sans KR"/>
+                <w:rFonts w:ascii="Malgun Gothic" w:hAnsi="Malgun Gothic" w:eastAsia="Malgun Gothic"/>
                 <w:b w:val="0"/>
-                <w:sz w:val="17"/>
+                <w:sz w:val="16"/>
               </w:rPr>
-              <w:t>숲길정보 ZIP, 숲서비스 및 둘레길 API</w:t>
+              <w:t>둘레길정보 ZIP, 숲길 서비스 API</w:t>
             </w:r>
           </w:p>
         </w:tc>
         <w:tc>
           <w:tcPr>
-            <w:tcW w:type="dxa" w:w="2556"/>
+            <w:tcW w:type="dxa" w:w="2863"/>
             <w:vAlign w:val="center"/>
+            <w:tcMar>
+              <w:top w:w="90" w:type="dxa"/>
+              <w:start w:w="90" w:type="dxa"/>
+              <w:bottom w:w="90" w:type="dxa"/>
+              <w:end w:w="90" w:type="dxa"/>
+            </w:tcMar>
           </w:tcPr>
           <w:p>
             <w:pPr>
-              <w:spacing w:after="0"/>
+              <w:spacing w:after="0" w:line="269" w:lineRule="auto"/>
             </w:pPr>
             <w:r/>
             <w:r>
               <w:rPr>
-                <w:rFonts w:ascii="Noto Sans KR" w:hAnsi="Noto Sans KR" w:eastAsia="Noto Sans KR"/>
+                <w:rFonts w:ascii="Malgun Gothic" w:hAnsi="Malgun Gothic" w:eastAsia="Malgun Gothic"/>
                 <w:b w:val="0"/>
-                <w:sz w:val="17"/>
+                <w:sz w:val="16"/>
               </w:rPr>
-              <w:t>client.travel.dulle_trail_features(), client.travel.forest_services()</w:t>
+              <w:t>travel.dulle_trail_features()</w:t>
+            </w:r>
+          </w:p>
+          <w:p>
+            <w:pPr>
+              <w:spacing w:after="0" w:line="269" w:lineRule="auto"/>
+            </w:pPr>
+            <w:r>
+              <w:rPr>
+                <w:rFonts w:ascii="Malgun Gothic" w:hAnsi="Malgun Gothic" w:eastAsia="Malgun Gothic"/>
+                <w:b w:val="0"/>
+                <w:sz w:val="16"/>
+              </w:rPr>
+              <w:t>travel.forest_services()</w:t>
             </w:r>
           </w:p>
         </w:tc>
         <w:tc>
           <w:tcPr>
-            <w:tcW w:type="dxa" w:w="2556"/>
+            <w:tcW w:type="dxa" w:w="2863"/>
             <w:vAlign w:val="center"/>
+            <w:tcMar>
+              <w:top w:w="90" w:type="dxa"/>
+              <w:start w:w="90" w:type="dxa"/>
+              <w:bottom w:w="90" w:type="dxa"/>
+              <w:end w:w="90" w:type="dxa"/>
+            </w:tcMar>
           </w:tcPr>
           <w:p>
             <w:pPr>
-              <w:spacing w:after="0"/>
+              <w:spacing w:after="0" w:line="269" w:lineRule="auto"/>
             </w:pPr>
             <w:r/>
             <w:r>
               <w:rPr>
-                <w:rFonts w:ascii="Noto Sans KR" w:hAnsi="Noto Sans KR" w:eastAsia="Noto Sans KR"/>
+                <w:rFonts w:ascii="Malgun Gothic" w:hAnsi="Malgun Gothic" w:eastAsia="Malgun Gothic"/>
                 <w:b w:val="0"/>
-                <w:sz w:val="17"/>
+                <w:sz w:val="16"/>
               </w:rPr>
-              <w:t>코스 경로, 거리, 소요시간 카드 구성</w:t>
+              <w:t>걷기 코스 경로, 거리, 예상 소요시간 카드</w:t>
             </w:r>
           </w:p>
         </w:tc>
@@ -431,40 +534,51 @@
       <w:tr>
         <w:tc>
           <w:tcPr>
-            <w:tcW w:type="dxa" w:w="2556"/>
+            <w:tcW w:type="dxa" w:w="1219"/>
             <w:vAlign w:val="center"/>
-            <w:shd w:fill="EAF3EF"/>
+            <w:tcMar>
+              <w:top w:w="90" w:type="dxa"/>
+              <w:start w:w="90" w:type="dxa"/>
+              <w:bottom w:w="90" w:type="dxa"/>
+              <w:end w:w="90" w:type="dxa"/>
+            </w:tcMar>
           </w:tcPr>
           <w:p>
             <w:pPr>
-              <w:spacing w:after="0"/>
+              <w:spacing w:after="0" w:line="269" w:lineRule="auto"/>
             </w:pPr>
             <w:r/>
             <w:r>
               <w:rPr>
-                <w:rFonts w:ascii="Noto Sans KR" w:hAnsi="Noto Sans KR" w:eastAsia="Noto Sans KR"/>
+                <w:rFonts w:ascii="Malgun Gothic" w:hAnsi="Malgun Gothic" w:eastAsia="Malgun Gothic"/>
                 <w:b w:val="0"/>
-                <w:sz w:val="17"/>
+                <w:sz w:val="16"/>
               </w:rPr>
-              <w:t>산·명산</w:t>
+              <w:t>명산</w:t>
             </w:r>
           </w:p>
         </w:tc>
         <w:tc>
           <w:tcPr>
-            <w:tcW w:type="dxa" w:w="2556"/>
+            <w:tcW w:type="dxa" w:w="2409"/>
             <w:vAlign w:val="center"/>
+            <w:tcMar>
+              <w:top w:w="90" w:type="dxa"/>
+              <w:start w:w="90" w:type="dxa"/>
+              <w:bottom w:w="90" w:type="dxa"/>
+              <w:end w:w="90" w:type="dxa"/>
+            </w:tcMar>
           </w:tcPr>
           <w:p>
             <w:pPr>
-              <w:spacing w:after="0"/>
+              <w:spacing w:after="0" w:line="269" w:lineRule="auto"/>
             </w:pPr>
             <w:r/>
             <w:r>
               <w:rPr>
-                <w:rFonts w:ascii="Noto Sans KR" w:hAnsi="Noto Sans KR" w:eastAsia="Noto Sans KR"/>
+                <w:rFonts w:ascii="Malgun Gothic" w:hAnsi="Malgun Gothic" w:eastAsia="Malgun Gothic"/>
                 <w:b w:val="0"/>
-                <w:sz w:val="17"/>
+                <w:sz w:val="16"/>
               </w:rPr>
               <w:t>산 정보, 명산등산로, 100대명산 파일데이터</w:t>
             </w:r>
@@ -472,41 +586,66 @@
         </w:tc>
         <w:tc>
           <w:tcPr>
-            <w:tcW w:type="dxa" w:w="2556"/>
+            <w:tcW w:type="dxa" w:w="2863"/>
             <w:vAlign w:val="center"/>
+            <w:tcMar>
+              <w:top w:w="90" w:type="dxa"/>
+              <w:start w:w="90" w:type="dxa"/>
+              <w:bottom w:w="90" w:type="dxa"/>
+              <w:end w:w="90" w:type="dxa"/>
+            </w:tcMar>
           </w:tcPr>
           <w:p>
             <w:pPr>
-              <w:spacing w:after="0"/>
+              <w:spacing w:after="0" w:line="269" w:lineRule="auto"/>
             </w:pPr>
             <w:r/>
             <w:r>
               <w:rPr>
-                <w:rFonts w:ascii="Noto Sans KR" w:hAnsi="Noto Sans KR" w:eastAsia="Noto Sans KR"/>
+                <w:rFonts w:ascii="Malgun Gothic" w:hAnsi="Malgun Gothic" w:eastAsia="Malgun Gothic"/>
                 <w:b w:val="0"/>
-                <w:sz w:val="17"/>
+                <w:sz w:val="16"/>
               </w:rPr>
-              <w:t>client.travel.mountain_stories(), client.travel.famous_mountain_trails()</w:t>
+              <w:t>travel.mountain_stories()</w:t>
+            </w:r>
+          </w:p>
+          <w:p>
+            <w:pPr>
+              <w:spacing w:after="0" w:line="269" w:lineRule="auto"/>
+            </w:pPr>
+            <w:r>
+              <w:rPr>
+                <w:rFonts w:ascii="Malgun Gothic" w:hAnsi="Malgun Gothic" w:eastAsia="Malgun Gothic"/>
+                <w:b w:val="0"/>
+                <w:sz w:val="16"/>
+              </w:rPr>
+              <w:t>travel.famous_mountain_trails()</w:t>
             </w:r>
           </w:p>
         </w:tc>
         <w:tc>
           <w:tcPr>
-            <w:tcW w:type="dxa" w:w="2556"/>
+            <w:tcW w:type="dxa" w:w="2863"/>
             <w:vAlign w:val="center"/>
+            <w:tcMar>
+              <w:top w:w="90" w:type="dxa"/>
+              <w:start w:w="90" w:type="dxa"/>
+              <w:bottom w:w="90" w:type="dxa"/>
+              <w:end w:w="90" w:type="dxa"/>
+            </w:tcMar>
           </w:tcPr>
           <w:p>
             <w:pPr>
-              <w:spacing w:after="0"/>
+              <w:spacing w:after="0" w:line="269" w:lineRule="auto"/>
             </w:pPr>
             <w:r/>
             <w:r>
               <w:rPr>
-                <w:rFonts w:ascii="Noto Sans KR" w:hAnsi="Noto Sans KR" w:eastAsia="Noto Sans KR"/>
+                <w:rFonts w:ascii="Malgun Gothic" w:hAnsi="Malgun Gothic" w:eastAsia="Malgun Gothic"/>
                 <w:b w:val="0"/>
-                <w:sz w:val="17"/>
+                <w:sz w:val="16"/>
               </w:rPr>
-              <w:t>산 상세, 교통, 선정이유, 추천 코스</w:t>
+              <w:t>산 상세, 접근성, 추천 코스, 주변 콘텐츠 연결</w:t>
             </w:r>
           </w:p>
         </w:tc>
@@ -514,20 +653,25 @@
       <w:tr>
         <w:tc>
           <w:tcPr>
-            <w:tcW w:type="dxa" w:w="2556"/>
+            <w:tcW w:type="dxa" w:w="1219"/>
             <w:vAlign w:val="center"/>
-            <w:shd w:fill="EAF3EF"/>
+            <w:tcMar>
+              <w:top w:w="90" w:type="dxa"/>
+              <w:start w:w="90" w:type="dxa"/>
+              <w:bottom w:w="90" w:type="dxa"/>
+              <w:end w:w="90" w:type="dxa"/>
+            </w:tcMar>
           </w:tcPr>
           <w:p>
             <w:pPr>
-              <w:spacing w:after="0"/>
+              <w:spacing w:after="0" w:line="269" w:lineRule="auto"/>
             </w:pPr>
             <w:r/>
             <w:r>
               <w:rPr>
-                <w:rFonts w:ascii="Noto Sans KR" w:hAnsi="Noto Sans KR" w:eastAsia="Noto Sans KR"/>
+                <w:rFonts w:ascii="Malgun Gothic" w:hAnsi="Malgun Gothic" w:eastAsia="Malgun Gothic"/>
                 <w:b w:val="0"/>
-                <w:sz w:val="17"/>
+                <w:sz w:val="16"/>
               </w:rPr>
               <w:t>휴양림·수목원</w:t>
             </w:r>
@@ -535,59 +679,90 @@
         </w:tc>
         <w:tc>
           <w:tcPr>
-            <w:tcW w:type="dxa" w:w="2556"/>
+            <w:tcW w:type="dxa" w:w="2409"/>
             <w:vAlign w:val="center"/>
+            <w:tcMar>
+              <w:top w:w="90" w:type="dxa"/>
+              <w:start w:w="90" w:type="dxa"/>
+              <w:bottom w:w="90" w:type="dxa"/>
+              <w:end w:w="90" w:type="dxa"/>
+            </w:tcMar>
           </w:tcPr>
           <w:p>
             <w:pPr>
-              <w:spacing w:after="0"/>
+              <w:spacing w:after="0" w:line="269" w:lineRule="auto"/>
             </w:pPr>
             <w:r/>
             <w:r>
               <w:rPr>
-                <w:rFonts w:ascii="Noto Sans KR" w:hAnsi="Noto Sans KR" w:eastAsia="Noto Sans KR"/>
+                <w:rFonts w:ascii="Malgun Gothic" w:hAnsi="Malgun Gothic" w:eastAsia="Malgun Gothic"/>
                 <w:b w:val="0"/>
-                <w:sz w:val="17"/>
+                <w:sz w:val="16"/>
               </w:rPr>
-              <w:t>휴양림수목원 위치도, 전국휴양림표준데이터, 휴양림 파일데이터</w:t>
+              <w:t>휴양림 표준데이터, 휴양림 파일데이터, 수목원 위치</w:t>
             </w:r>
           </w:p>
         </w:tc>
         <w:tc>
           <w:tcPr>
-            <w:tcW w:type="dxa" w:w="2556"/>
+            <w:tcW w:type="dxa" w:w="2863"/>
             <w:vAlign w:val="center"/>
+            <w:tcMar>
+              <w:top w:w="90" w:type="dxa"/>
+              <w:start w:w="90" w:type="dxa"/>
+              <w:bottom w:w="90" w:type="dxa"/>
+              <w:end w:w="90" w:type="dxa"/>
+            </w:tcMar>
           </w:tcPr>
           <w:p>
             <w:pPr>
-              <w:spacing w:after="0"/>
+              <w:spacing w:after="0" w:line="269" w:lineRule="auto"/>
             </w:pPr>
             <w:r/>
             <w:r>
               <w:rPr>
-                <w:rFonts w:ascii="Noto Sans KR" w:hAnsi="Noto Sans KR" w:eastAsia="Noto Sans KR"/>
+                <w:rFonts w:ascii="Malgun Gothic" w:hAnsi="Malgun Gothic" w:eastAsia="Malgun Gothic"/>
                 <w:b w:val="0"/>
-                <w:sz w:val="17"/>
+                <w:sz w:val="16"/>
               </w:rPr>
-              <w:t>client.travel.recreation_forest_arboretums(), client.travel.standard_recreation_forests(), client.travel.recreation_forests()</w:t>
+              <w:t>travel.standard_recreation_forests()</w:t>
+            </w:r>
+          </w:p>
+          <w:p>
+            <w:pPr>
+              <w:spacing w:after="0" w:line="269" w:lineRule="auto"/>
+            </w:pPr>
+            <w:r>
+              <w:rPr>
+                <w:rFonts w:ascii="Malgun Gothic" w:hAnsi="Malgun Gothic" w:eastAsia="Malgun Gothic"/>
+                <w:b w:val="0"/>
+                <w:sz w:val="16"/>
+              </w:rPr>
+              <w:t>travel.recreation_forests()</w:t>
             </w:r>
           </w:p>
         </w:tc>
         <w:tc>
           <w:tcPr>
-            <w:tcW w:type="dxa" w:w="2556"/>
+            <w:tcW w:type="dxa" w:w="2863"/>
             <w:vAlign w:val="center"/>
+            <w:tcMar>
+              <w:top w:w="90" w:type="dxa"/>
+              <w:start w:w="90" w:type="dxa"/>
+              <w:bottom w:w="90" w:type="dxa"/>
+              <w:end w:w="90" w:type="dxa"/>
+            </w:tcMar>
           </w:tcPr>
           <w:p>
             <w:pPr>
-              <w:spacing w:after="0"/>
+              <w:spacing w:after="0" w:line="269" w:lineRule="auto"/>
             </w:pPr>
             <w:r/>
             <w:r>
               <w:rPr>
-                <w:rFonts w:ascii="Noto Sans KR" w:hAnsi="Noto Sans KR" w:eastAsia="Noto Sans KR"/>
+                <w:rFonts w:ascii="Malgun Gothic" w:hAnsi="Malgun Gothic" w:eastAsia="Malgun Gothic"/>
                 <w:b w:val="0"/>
-                <w:sz w:val="17"/>
+                <w:sz w:val="16"/>
               </w:rPr>
               <w:t>숙박·휴식 POI, 주소, 연락처, 홈페이지, 예약 보조</w:t>
             </w:r>
@@ -597,20 +772,25 @@
       <w:tr>
         <w:tc>
           <w:tcPr>
-            <w:tcW w:type="dxa" w:w="2556"/>
+            <w:tcW w:type="dxa" w:w="1219"/>
             <w:vAlign w:val="center"/>
-            <w:shd w:fill="EAF3EF"/>
+            <w:tcMar>
+              <w:top w:w="90" w:type="dxa"/>
+              <w:start w:w="90" w:type="dxa"/>
+              <w:bottom w:w="90" w:type="dxa"/>
+              <w:end w:w="90" w:type="dxa"/>
+            </w:tcMar>
           </w:tcPr>
           <w:p>
             <w:pPr>
-              <w:spacing w:after="0"/>
+              <w:spacing w:after="0" w:line="269" w:lineRule="auto"/>
             </w:pPr>
             <w:r/>
             <w:r>
               <w:rPr>
-                <w:rFonts w:ascii="Noto Sans KR" w:hAnsi="Noto Sans KR" w:eastAsia="Noto Sans KR"/>
+                <w:rFonts w:ascii="Malgun Gothic" w:hAnsi="Malgun Gothic" w:eastAsia="Malgun Gothic"/>
                 <w:b w:val="0"/>
-                <w:sz w:val="17"/>
+                <w:sz w:val="16"/>
               </w:rPr>
               <w:t>교육·체험</w:t>
             </w:r>
@@ -618,61 +798,92 @@
         </w:tc>
         <w:tc>
           <w:tcPr>
-            <w:tcW w:type="dxa" w:w="2556"/>
+            <w:tcW w:type="dxa" w:w="2409"/>
             <w:vAlign w:val="center"/>
+            <w:tcMar>
+              <w:top w:w="90" w:type="dxa"/>
+              <w:start w:w="90" w:type="dxa"/>
+              <w:bottom w:w="90" w:type="dxa"/>
+              <w:end w:w="90" w:type="dxa"/>
+            </w:tcMar>
           </w:tcPr>
           <w:p>
             <w:pPr>
-              <w:spacing w:after="0"/>
+              <w:spacing w:after="0" w:line="269" w:lineRule="auto"/>
             </w:pPr>
             <w:r/>
             <w:r>
               <w:rPr>
-                <w:rFonts w:ascii="Noto Sans KR" w:hAnsi="Noto Sans KR" w:eastAsia="Noto Sans KR"/>
+                <w:rFonts w:ascii="Malgun Gothic" w:hAnsi="Malgun Gothic" w:eastAsia="Malgun Gothic"/>
                 <w:b w:val="0"/>
-                <w:sz w:val="17"/>
+                <w:sz w:val="16"/>
               </w:rPr>
-              <w:t>산림교육센터 현황, 유아숲체험원 현황</w:t>
+              <w:t>산림교육센터, 유아숲체험원</w:t>
             </w:r>
           </w:p>
         </w:tc>
         <w:tc>
           <w:tcPr>
-            <w:tcW w:type="dxa" w:w="2556"/>
+            <w:tcW w:type="dxa" w:w="2863"/>
             <w:vAlign w:val="center"/>
+            <w:tcMar>
+              <w:top w:w="90" w:type="dxa"/>
+              <w:start w:w="90" w:type="dxa"/>
+              <w:bottom w:w="90" w:type="dxa"/>
+              <w:end w:w="90" w:type="dxa"/>
+            </w:tcMar>
           </w:tcPr>
           <w:p>
             <w:pPr>
-              <w:spacing w:after="0"/>
+              <w:spacing w:after="0" w:line="269" w:lineRule="auto"/>
             </w:pPr>
             <w:r/>
             <w:r>
               <w:rPr>
-                <w:rFonts w:ascii="Noto Sans KR" w:hAnsi="Noto Sans KR" w:eastAsia="Noto Sans KR"/>
+                <w:rFonts w:ascii="Malgun Gothic" w:hAnsi="Malgun Gothic" w:eastAsia="Malgun Gothic"/>
                 <w:b w:val="0"/>
-                <w:sz w:val="17"/>
+                <w:sz w:val="16"/>
               </w:rPr>
-              <w:t>client.travel.forest_education_centers(), client.travel.kid_forest_centers()</w:t>
+              <w:t>travel.forest_education_centers()</w:t>
+            </w:r>
+          </w:p>
+          <w:p>
+            <w:pPr>
+              <w:spacing w:after="0" w:line="269" w:lineRule="auto"/>
+            </w:pPr>
+            <w:r>
+              <w:rPr>
+                <w:rFonts w:ascii="Malgun Gothic" w:hAnsi="Malgun Gothic" w:eastAsia="Malgun Gothic"/>
+                <w:b w:val="0"/>
+                <w:sz w:val="16"/>
+              </w:rPr>
+              <w:t>travel.kid_forest_centers()</w:t>
             </w:r>
           </w:p>
         </w:tc>
         <w:tc>
           <w:tcPr>
-            <w:tcW w:type="dxa" w:w="2556"/>
+            <w:tcW w:type="dxa" w:w="2863"/>
             <w:vAlign w:val="center"/>
+            <w:tcMar>
+              <w:top w:w="90" w:type="dxa"/>
+              <w:start w:w="90" w:type="dxa"/>
+              <w:bottom w:w="90" w:type="dxa"/>
+              <w:end w:w="90" w:type="dxa"/>
+            </w:tcMar>
           </w:tcPr>
           <w:p>
             <w:pPr>
-              <w:spacing w:after="0"/>
+              <w:spacing w:after="0" w:line="269" w:lineRule="auto"/>
             </w:pPr>
             <w:r/>
             <w:r>
               <w:rPr>
-                <w:rFonts w:ascii="Noto Sans KR" w:hAnsi="Noto Sans KR" w:eastAsia="Noto Sans KR"/>
+                <w:rFonts w:ascii="Malgun Gothic" w:hAnsi="Malgun Gothic" w:eastAsia="Malgun Gothic"/>
                 <w:b w:val="0"/>
-                <w:sz w:val="17"/>
+                <w:sz w:val="16"/>
               </w:rPr>
-              <w:t>가족 여행, 체험형 일정 추천</w:t>
+              <w:t>가족 여행, 체험형 일정 추천, 연령대 필터</w:t>
             </w:r>
           </w:p>
         </w:tc>
@@ -680,20 +891,25 @@
       <w:tr>
         <w:tc>
           <w:tcPr>
-            <w:tcW w:type="dxa" w:w="2556"/>
+            <w:tcW w:type="dxa" w:w="1219"/>
             <w:vAlign w:val="center"/>
-            <w:shd w:fill="EAF3EF"/>
+            <w:tcMar>
+              <w:top w:w="90" w:type="dxa"/>
+              <w:start w:w="90" w:type="dxa"/>
+              <w:bottom w:w="90" w:type="dxa"/>
+              <w:end w:w="90" w:type="dxa"/>
+            </w:tcMar>
           </w:tcPr>
           <w:p>
             <w:pPr>
-              <w:spacing w:after="0"/>
+              <w:spacing w:after="0" w:line="269" w:lineRule="auto"/>
             </w:pPr>
             <w:r/>
             <w:r>
               <w:rPr>
-                <w:rFonts w:ascii="Noto Sans KR" w:hAnsi="Noto Sans KR" w:eastAsia="Noto Sans KR"/>
+                <w:rFonts w:ascii="Malgun Gothic" w:hAnsi="Malgun Gothic" w:eastAsia="Malgun Gothic"/>
                 <w:b w:val="0"/>
-                <w:sz w:val="17"/>
+                <w:sz w:val="16"/>
               </w:rPr>
               <w:t>전통마을숲</w:t>
             </w:r>
@@ -701,59 +917,77 @@
         </w:tc>
         <w:tc>
           <w:tcPr>
-            <w:tcW w:type="dxa" w:w="2556"/>
+            <w:tcW w:type="dxa" w:w="2409"/>
             <w:vAlign w:val="center"/>
+            <w:tcMar>
+              <w:top w:w="90" w:type="dxa"/>
+              <w:start w:w="90" w:type="dxa"/>
+              <w:bottom w:w="90" w:type="dxa"/>
+              <w:end w:w="90" w:type="dxa"/>
+            </w:tcMar>
           </w:tcPr>
           <w:p>
             <w:pPr>
-              <w:spacing w:after="0"/>
+              <w:spacing w:after="0" w:line="269" w:lineRule="auto"/>
             </w:pPr>
             <w:r/>
             <w:r>
               <w:rPr>
-                <w:rFonts w:ascii="Noto Sans KR" w:hAnsi="Noto Sans KR" w:eastAsia="Noto Sans KR"/>
+                <w:rFonts w:ascii="Malgun Gothic" w:hAnsi="Malgun Gothic" w:eastAsia="Malgun Gothic"/>
                 <w:b w:val="0"/>
-                <w:sz w:val="17"/>
+                <w:sz w:val="16"/>
               </w:rPr>
-              <w:t>전통마을숲 위치도</w:t>
+              <w:t>전통마을숲 위치</w:t>
             </w:r>
           </w:p>
         </w:tc>
         <w:tc>
           <w:tcPr>
-            <w:tcW w:type="dxa" w:w="2556"/>
+            <w:tcW w:type="dxa" w:w="2863"/>
             <w:vAlign w:val="center"/>
+            <w:tcMar>
+              <w:top w:w="90" w:type="dxa"/>
+              <w:start w:w="90" w:type="dxa"/>
+              <w:bottom w:w="90" w:type="dxa"/>
+              <w:end w:w="90" w:type="dxa"/>
+            </w:tcMar>
           </w:tcPr>
           <w:p>
             <w:pPr>
-              <w:spacing w:after="0"/>
+              <w:spacing w:after="0" w:line="269" w:lineRule="auto"/>
             </w:pPr>
             <w:r/>
             <w:r>
               <w:rPr>
-                <w:rFonts w:ascii="Noto Sans KR" w:hAnsi="Noto Sans KR" w:eastAsia="Noto Sans KR"/>
+                <w:rFonts w:ascii="Malgun Gothic" w:hAnsi="Malgun Gothic" w:eastAsia="Malgun Gothic"/>
                 <w:b w:val="0"/>
-                <w:sz w:val="17"/>
+                <w:sz w:val="16"/>
               </w:rPr>
-              <w:t>client.travel.traditional_village_forests()</w:t>
+              <w:t>travel.traditional_village_forests()</w:t>
             </w:r>
           </w:p>
         </w:tc>
         <w:tc>
           <w:tcPr>
-            <w:tcW w:type="dxa" w:w="2556"/>
+            <w:tcW w:type="dxa" w:w="2863"/>
             <w:vAlign w:val="center"/>
+            <w:tcMar>
+              <w:top w:w="90" w:type="dxa"/>
+              <w:start w:w="90" w:type="dxa"/>
+              <w:bottom w:w="90" w:type="dxa"/>
+              <w:end w:w="90" w:type="dxa"/>
+            </w:tcMar>
           </w:tcPr>
           <w:p>
             <w:pPr>
-              <w:spacing w:after="0"/>
+              <w:spacing w:after="0" w:line="269" w:lineRule="auto"/>
             </w:pPr>
             <w:r/>
             <w:r>
               <w:rPr>
-                <w:rFonts w:ascii="Noto Sans KR" w:hAnsi="Noto Sans KR" w:eastAsia="Noto Sans KR"/>
+                <w:rFonts w:ascii="Malgun Gothic" w:hAnsi="Malgun Gothic" w:eastAsia="Malgun Gothic"/>
                 <w:b w:val="0"/>
-                <w:sz w:val="17"/>
+                <w:sz w:val="16"/>
               </w:rPr>
               <w:t>문화·마을 산책 POI와 주변 코스 연결</w:t>
             </w:r>
@@ -763,20 +997,25 @@
       <w:tr>
         <w:tc>
           <w:tcPr>
-            <w:tcW w:type="dxa" w:w="2556"/>
+            <w:tcW w:type="dxa" w:w="1219"/>
             <w:vAlign w:val="center"/>
-            <w:shd w:fill="EAF3EF"/>
+            <w:tcMar>
+              <w:top w:w="90" w:type="dxa"/>
+              <w:start w:w="90" w:type="dxa"/>
+              <w:bottom w:w="90" w:type="dxa"/>
+              <w:end w:w="90" w:type="dxa"/>
+            </w:tcMar>
           </w:tcPr>
           <w:p>
             <w:pPr>
-              <w:spacing w:after="0"/>
+              <w:spacing w:after="0" w:line="269" w:lineRule="auto"/>
             </w:pPr>
             <w:r/>
             <w:r>
               <w:rPr>
-                <w:rFonts w:ascii="Noto Sans KR" w:hAnsi="Noto Sans KR" w:eastAsia="Noto Sans KR"/>
+                <w:rFonts w:ascii="Malgun Gothic" w:hAnsi="Malgun Gothic" w:eastAsia="Malgun Gothic"/>
                 <w:b w:val="0"/>
-                <w:sz w:val="17"/>
+                <w:sz w:val="16"/>
               </w:rPr>
               <w:t>산불 위험</w:t>
             </w:r>
@@ -784,61 +1023,92 @@
         </w:tc>
         <w:tc>
           <w:tcPr>
-            <w:tcW w:type="dxa" w:w="2556"/>
+            <w:tcW w:type="dxa" w:w="2409"/>
             <w:vAlign w:val="center"/>
+            <w:tcMar>
+              <w:top w:w="90" w:type="dxa"/>
+              <w:start w:w="90" w:type="dxa"/>
+              <w:bottom w:w="90" w:type="dxa"/>
+              <w:end w:w="90" w:type="dxa"/>
+            </w:tcMar>
           </w:tcPr>
           <w:p>
             <w:pPr>
-              <w:spacing w:after="0"/>
+              <w:spacing w:after="0" w:line="269" w:lineRule="auto"/>
             </w:pPr>
             <w:r/>
             <w:r>
               <w:rPr>
-                <w:rFonts w:ascii="Noto Sans KR" w:hAnsi="Noto Sans KR" w:eastAsia="Noto Sans KR"/>
+                <w:rFonts w:ascii="Malgun Gothic" w:hAnsi="Malgun Gothic" w:eastAsia="Malgun Gothic"/>
                 <w:b w:val="0"/>
-                <w:sz w:val="17"/>
+                <w:sz w:val="16"/>
               </w:rPr>
-              <w:t>산불위험예보정보, 산불통계, 산불 이미지·시설 파일데이터</w:t>
+              <w:t>산불위험예보, 산불 발생 통계</w:t>
             </w:r>
           </w:p>
         </w:tc>
         <w:tc>
           <w:tcPr>
-            <w:tcW w:type="dxa" w:w="2556"/>
+            <w:tcW w:type="dxa" w:w="2863"/>
             <w:vAlign w:val="center"/>
+            <w:tcMar>
+              <w:top w:w="90" w:type="dxa"/>
+              <w:start w:w="90" w:type="dxa"/>
+              <w:bottom w:w="90" w:type="dxa"/>
+              <w:end w:w="90" w:type="dxa"/>
+            </w:tcMar>
           </w:tcPr>
           <w:p>
             <w:pPr>
-              <w:spacing w:after="0"/>
+              <w:spacing w:after="0" w:line="269" w:lineRule="auto"/>
             </w:pPr>
             <w:r/>
             <w:r>
               <w:rPr>
-                <w:rFonts w:ascii="Noto Sans KR" w:hAnsi="Noto Sans KR" w:eastAsia="Noto Sans KR"/>
+                <w:rFonts w:ascii="Malgun Gothic" w:hAnsi="Malgun Gothic" w:eastAsia="Malgun Gothic"/>
                 <w:b w:val="0"/>
-                <w:sz w:val="17"/>
+                <w:sz w:val="16"/>
               </w:rPr>
-              <w:t>client.safety.wildfire_risk_forecast(), client.safety.wildfire_stats()</w:t>
+              <w:t>safety.wildfire_risk_forecast()</w:t>
+            </w:r>
+          </w:p>
+          <w:p>
+            <w:pPr>
+              <w:spacing w:after="0" w:line="269" w:lineRule="auto"/>
+            </w:pPr>
+            <w:r>
+              <w:rPr>
+                <w:rFonts w:ascii="Malgun Gothic" w:hAnsi="Malgun Gothic" w:eastAsia="Malgun Gothic"/>
+                <w:b w:val="0"/>
+                <w:sz w:val="16"/>
+              </w:rPr>
+              <w:t>safety.wildfire_stats()</w:t>
             </w:r>
           </w:p>
         </w:tc>
         <w:tc>
           <w:tcPr>
-            <w:tcW w:type="dxa" w:w="2556"/>
+            <w:tcW w:type="dxa" w:w="2863"/>
             <w:vAlign w:val="center"/>
+            <w:tcMar>
+              <w:top w:w="90" w:type="dxa"/>
+              <w:start w:w="90" w:type="dxa"/>
+              <w:bottom w:w="90" w:type="dxa"/>
+              <w:end w:w="90" w:type="dxa"/>
+            </w:tcMar>
           </w:tcPr>
           <w:p>
             <w:pPr>
-              <w:spacing w:after="0"/>
+              <w:spacing w:after="0" w:line="269" w:lineRule="auto"/>
             </w:pPr>
             <w:r/>
             <w:r>
               <w:rPr>
-                <w:rFonts w:ascii="Noto Sans KR" w:hAnsi="Noto Sans KR" w:eastAsia="Noto Sans KR"/>
+                <w:rFonts w:ascii="Malgun Gothic" w:hAnsi="Malgun Gothic" w:eastAsia="Malgun Gothic"/>
                 <w:b w:val="0"/>
-                <w:sz w:val="17"/>
+                <w:sz w:val="16"/>
               </w:rPr>
-              <w:t>위험등급 배지, 고위험 지역 안내, 과거 이력 참고</w:t>
+              <w:t>위험 등급 배지, 고위험 지역 안내, 과거 이력 참고</w:t>
             </w:r>
           </w:p>
         </w:tc>
@@ -846,20 +1116,25 @@
       <w:tr>
         <w:tc>
           <w:tcPr>
-            <w:tcW w:type="dxa" w:w="2556"/>
+            <w:tcW w:type="dxa" w:w="1219"/>
             <w:vAlign w:val="center"/>
-            <w:shd w:fill="EAF3EF"/>
+            <w:tcMar>
+              <w:top w:w="90" w:type="dxa"/>
+              <w:start w:w="90" w:type="dxa"/>
+              <w:bottom w:w="90" w:type="dxa"/>
+              <w:end w:w="90" w:type="dxa"/>
+            </w:tcMar>
           </w:tcPr>
           <w:p>
             <w:pPr>
-              <w:spacing w:after="0"/>
+              <w:spacing w:after="0" w:line="269" w:lineRule="auto"/>
             </w:pPr>
             <w:r/>
             <w:r>
               <w:rPr>
-                <w:rFonts w:ascii="Noto Sans KR" w:hAnsi="Noto Sans KR" w:eastAsia="Noto Sans KR"/>
+                <w:rFonts w:ascii="Malgun Gothic" w:hAnsi="Malgun Gothic" w:eastAsia="Malgun Gothic"/>
                 <w:b w:val="0"/>
-                <w:sz w:val="17"/>
+                <w:sz w:val="16"/>
               </w:rPr>
               <w:t>산사태 위험</w:t>
             </w:r>
@@ -867,19 +1142,25 @@
         </w:tc>
         <w:tc>
           <w:tcPr>
-            <w:tcW w:type="dxa" w:w="2556"/>
+            <w:tcW w:type="dxa" w:w="2409"/>
             <w:vAlign w:val="center"/>
+            <w:tcMar>
+              <w:top w:w="90" w:type="dxa"/>
+              <w:start w:w="90" w:type="dxa"/>
+              <w:bottom w:w="90" w:type="dxa"/>
+              <w:end w:w="90" w:type="dxa"/>
+            </w:tcMar>
           </w:tcPr>
           <w:p>
             <w:pPr>
-              <w:spacing w:after="0"/>
+              <w:spacing w:after="0" w:line="269" w:lineRule="auto"/>
             </w:pPr>
             <w:r/>
             <w:r>
               <w:rPr>
-                <w:rFonts w:ascii="Noto Sans KR" w:hAnsi="Noto Sans KR" w:eastAsia="Noto Sans KR"/>
+                <w:rFonts w:ascii="Malgun Gothic" w:hAnsi="Malgun Gothic" w:eastAsia="Malgun Gothic"/>
                 <w:b w:val="0"/>
-                <w:sz w:val="17"/>
+                <w:sz w:val="16"/>
               </w:rPr>
               <w:t>산사태위험지도, 산사태 예측·예보·이력</w:t>
             </w:r>
@@ -887,39 +1168,64 @@
         </w:tc>
         <w:tc>
           <w:tcPr>
-            <w:tcW w:type="dxa" w:w="2556"/>
+            <w:tcW w:type="dxa" w:w="2863"/>
             <w:vAlign w:val="center"/>
+            <w:tcMar>
+              <w:top w:w="90" w:type="dxa"/>
+              <w:start w:w="90" w:type="dxa"/>
+              <w:bottom w:w="90" w:type="dxa"/>
+              <w:end w:w="90" w:type="dxa"/>
+            </w:tcMar>
           </w:tcPr>
           <w:p>
             <w:pPr>
-              <w:spacing w:after="0"/>
+              <w:spacing w:after="0" w:line="269" w:lineRule="auto"/>
             </w:pPr>
             <w:r/>
             <w:r>
               <w:rPr>
-                <w:rFonts w:ascii="Noto Sans KR" w:hAnsi="Noto Sans KR" w:eastAsia="Noto Sans KR"/>
+                <w:rFonts w:ascii="Malgun Gothic" w:hAnsi="Malgun Gothic" w:eastAsia="Malgun Gothic"/>
                 <w:b w:val="0"/>
-                <w:sz w:val="17"/>
+                <w:sz w:val="16"/>
               </w:rPr>
-              <w:t>client.safety.landslide_risk_map_files(), client.safety.landslide_predictions(), client.safety.landslide_forecast_issues()</w:t>
+              <w:t>safety.landslide_risk_map_files()</w:t>
+            </w:r>
+          </w:p>
+          <w:p>
+            <w:pPr>
+              <w:spacing w:after="0" w:line="269" w:lineRule="auto"/>
+            </w:pPr>
+            <w:r>
+              <w:rPr>
+                <w:rFonts w:ascii="Malgun Gothic" w:hAnsi="Malgun Gothic" w:eastAsia="Malgun Gothic"/>
+                <w:b w:val="0"/>
+                <w:sz w:val="16"/>
+              </w:rPr>
+              <w:t>safety.landslide_predictions()</w:t>
             </w:r>
           </w:p>
         </w:tc>
         <w:tc>
           <w:tcPr>
-            <w:tcW w:type="dxa" w:w="2556"/>
+            <w:tcW w:type="dxa" w:w="2863"/>
             <w:vAlign w:val="center"/>
+            <w:tcMar>
+              <w:top w:w="90" w:type="dxa"/>
+              <w:start w:w="90" w:type="dxa"/>
+              <w:bottom w:w="90" w:type="dxa"/>
+              <w:end w:w="90" w:type="dxa"/>
+            </w:tcMar>
           </w:tcPr>
           <w:p>
             <w:pPr>
-              <w:spacing w:after="0"/>
+              <w:spacing w:after="0" w:line="269" w:lineRule="auto"/>
             </w:pPr>
             <w:r/>
             <w:r>
               <w:rPr>
-                <w:rFonts w:ascii="Noto Sans KR" w:hAnsi="Noto Sans KR" w:eastAsia="Noto Sans KR"/>
+                <w:rFonts w:ascii="Malgun Gothic" w:hAnsi="Malgun Gothic" w:eastAsia="Malgun Gothic"/>
                 <w:b w:val="0"/>
-                <w:sz w:val="17"/>
+                <w:sz w:val="16"/>
               </w:rPr>
               <w:t>산행·드라이브 경로 주변 위험도 경고</w:t>
             </w:r>
@@ -929,20 +1235,25 @@
       <w:tr>
         <w:tc>
           <w:tcPr>
-            <w:tcW w:type="dxa" w:w="2556"/>
+            <w:tcW w:type="dxa" w:w="1219"/>
             <w:vAlign w:val="center"/>
-            <w:shd w:fill="EAF3EF"/>
+            <w:tcMar>
+              <w:top w:w="90" w:type="dxa"/>
+              <w:start w:w="90" w:type="dxa"/>
+              <w:bottom w:w="90" w:type="dxa"/>
+              <w:end w:w="90" w:type="dxa"/>
+            </w:tcMar>
           </w:tcPr>
           <w:p>
             <w:pPr>
-              <w:spacing w:after="0"/>
+              <w:spacing w:after="0" w:line="269" w:lineRule="auto"/>
             </w:pPr>
             <w:r/>
             <w:r>
               <w:rPr>
-                <w:rFonts w:ascii="Noto Sans KR" w:hAnsi="Noto Sans KR" w:eastAsia="Noto Sans KR"/>
+                <w:rFonts w:ascii="Malgun Gothic" w:hAnsi="Malgun Gothic" w:eastAsia="Malgun Gothic"/>
                 <w:b w:val="0"/>
-                <w:sz w:val="17"/>
+                <w:sz w:val="16"/>
               </w:rPr>
               <w:t>대응 시설</w:t>
             </w:r>
@@ -950,59 +1261,77 @@
         </w:tc>
         <w:tc>
           <w:tcPr>
-            <w:tcW w:type="dxa" w:w="2556"/>
+            <w:tcW w:type="dxa" w:w="2409"/>
             <w:vAlign w:val="center"/>
+            <w:tcMar>
+              <w:top w:w="90" w:type="dxa"/>
+              <w:start w:w="90" w:type="dxa"/>
+              <w:bottom w:w="90" w:type="dxa"/>
+              <w:end w:w="90" w:type="dxa"/>
+            </w:tcMar>
           </w:tcPr>
           <w:p>
             <w:pPr>
-              <w:spacing w:after="0"/>
+              <w:spacing w:after="0" w:line="269" w:lineRule="auto"/>
             </w:pPr>
             <w:r/>
             <w:r>
               <w:rPr>
-                <w:rFonts w:ascii="Noto Sans KR" w:hAnsi="Noto Sans KR" w:eastAsia="Noto Sans KR"/>
+                <w:rFonts w:ascii="Malgun Gothic" w:hAnsi="Malgun Gothic" w:eastAsia="Malgun Gothic"/>
                 <w:b w:val="0"/>
-                <w:sz w:val="17"/>
+                <w:sz w:val="16"/>
               </w:rPr>
-              <w:t>사방댐, 담수용사방댐, 진화대원대기장소, 산불소화시설</w:t>
+              <w:t>사방댐, 산불소화시설, 진화대원 대기장소 등</w:t>
             </w:r>
           </w:p>
         </w:tc>
         <w:tc>
           <w:tcPr>
-            <w:tcW w:type="dxa" w:w="2556"/>
+            <w:tcW w:type="dxa" w:w="2863"/>
             <w:vAlign w:val="center"/>
+            <w:tcMar>
+              <w:top w:w="90" w:type="dxa"/>
+              <w:start w:w="90" w:type="dxa"/>
+              <w:bottom w:w="90" w:type="dxa"/>
+              <w:end w:w="90" w:type="dxa"/>
+            </w:tcMar>
           </w:tcPr>
           <w:p>
             <w:pPr>
-              <w:spacing w:after="0"/>
+              <w:spacing w:after="0" w:line="269" w:lineRule="auto"/>
             </w:pPr>
             <w:r/>
             <w:r>
               <w:rPr>
-                <w:rFonts w:ascii="Noto Sans KR" w:hAnsi="Noto Sans KR" w:eastAsia="Noto Sans KR"/>
+                <w:rFonts w:ascii="Malgun Gothic" w:hAnsi="Malgun Gothic" w:eastAsia="Malgun Gothic"/>
                 <w:b w:val="0"/>
-                <w:sz w:val="17"/>
+                <w:sz w:val="16"/>
               </w:rPr>
-              <w:t>client.safety.erosion_control_dams(), 파일데이터 카탈로그</w:t>
+              <w:t>safety.erosion_control_dams()</w:t>
             </w:r>
           </w:p>
         </w:tc>
         <w:tc>
           <w:tcPr>
-            <w:tcW w:type="dxa" w:w="2556"/>
+            <w:tcW w:type="dxa" w:w="2863"/>
             <w:vAlign w:val="center"/>
+            <w:tcMar>
+              <w:top w:w="90" w:type="dxa"/>
+              <w:start w:w="90" w:type="dxa"/>
+              <w:bottom w:w="90" w:type="dxa"/>
+              <w:end w:w="90" w:type="dxa"/>
+            </w:tcMar>
           </w:tcPr>
           <w:p>
             <w:pPr>
-              <w:spacing w:after="0"/>
+              <w:spacing w:after="0" w:line="269" w:lineRule="auto"/>
             </w:pPr>
             <w:r/>
             <w:r>
               <w:rPr>
-                <w:rFonts w:ascii="Noto Sans KR" w:hAnsi="Noto Sans KR" w:eastAsia="Noto Sans KR"/>
+                <w:rFonts w:ascii="Malgun Gothic" w:hAnsi="Malgun Gothic" w:eastAsia="Malgun Gothic"/>
                 <w:b w:val="0"/>
-                <w:sz w:val="17"/>
+                <w:sz w:val="16"/>
               </w:rPr>
               <w:t>내부 운영 지도, 관리자용 안전 레이어</w:t>
             </w:r>
@@ -1013,195 +1342,155 @@
     <w:p>
       <w:pPr>
         <w:pStyle w:val="Heading1"/>
+        <w:spacing w:before="240" w:after="100"/>
       </w:pPr>
       <w:r>
-        <w:t>Tripmate 기능 제안</w:t>
+        <w:rPr>
+          <w:rFonts w:ascii="Malgun Gothic" w:hAnsi="Malgun Gothic" w:eastAsia="Malgun Gothic"/>
+          <w:b/>
+          <w:color w:val="1F4E3D"/>
+          <w:sz w:val="30"/>
+        </w:rPr>
+        <w:t>TripMate 기능 제안</w:t>
       </w:r>
     </w:p>
     <w:p>
+      <w:pPr>
+        <w:pStyle w:val="ListBullet"/>
+        <w:spacing w:line="283" w:lineRule="auto" w:after="60"/>
+      </w:pPr>
       <w:r>
         <w:rPr>
-          <w:rFonts w:ascii="Noto Sans KR" w:hAnsi="Noto Sans KR" w:eastAsia="Noto Sans KR"/>
-          <w:sz w:val="20"/>
+          <w:rFonts w:ascii="Malgun Gothic" w:hAnsi="Malgun Gothic" w:eastAsia="Malgun Gothic"/>
+          <w:b w:val="0"/>
+          <w:sz w:val="19"/>
         </w:rPr>
-        <w:t>1. 지도 기본 레이어는 산·숲길·휴양림으로 구성하고, 안전 레이어는 사용자가 켤 수</w:t>
+        <w:t>기본 지도는 산림복지 레이어와 산림재난 레이어를 분리한다.</w:t>
       </w:r>
     </w:p>
     <w:p>
+      <w:pPr>
+        <w:pStyle w:val="ListBullet"/>
+        <w:spacing w:line="283" w:lineRule="auto" w:after="60"/>
+      </w:pPr>
       <w:r>
         <w:rPr>
-          <w:rFonts w:ascii="Noto Sans KR" w:hAnsi="Noto Sans KR" w:eastAsia="Noto Sans KR"/>
-          <w:sz w:val="20"/>
+          <w:rFonts w:ascii="Malgun Gothic" w:hAnsi="Malgun Gothic" w:eastAsia="Malgun Gothic"/>
+          <w:b w:val="0"/>
+          <w:sz w:val="19"/>
         </w:rPr>
-        <w:t>있는 토글로 둔다.</w:t>
+        <w:t>산행 상세 화면에는 산악기상 관측시각, 기온, 습도, 풍속, 강수량, 지면온도를 작은 상태 카드로 표시한다.</w:t>
       </w:r>
     </w:p>
     <w:p>
+      <w:pPr>
+        <w:pStyle w:val="ListBullet"/>
+        <w:spacing w:line="283" w:lineRule="auto" w:after="60"/>
+      </w:pPr>
       <w:r>
         <w:rPr>
-          <w:rFonts w:ascii="Noto Sans KR" w:hAnsi="Noto Sans KR" w:eastAsia="Noto Sans KR"/>
-          <w:sz w:val="20"/>
+          <w:rFonts w:ascii="Malgun Gothic" w:hAnsi="Malgun Gothic" w:eastAsia="Malgun Gothic"/>
+          <w:b w:val="0"/>
+          <w:sz w:val="19"/>
         </w:rPr>
-        <w:t>2. 산행 상세 화면에는 산악기상 관측시각, 강수량, 풍속, 습도, 지면온도를 짧은</w:t>
+        <w:t>등산로·둘레길 geometry는 경로 탐색 엔진의 원천이 아니라 참고 레이어로 먼저 노출한다.</w:t>
       </w:r>
     </w:p>
     <w:p>
+      <w:pPr>
+        <w:pStyle w:val="ListBullet"/>
+        <w:spacing w:line="283" w:lineRule="auto" w:after="60"/>
+      </w:pPr>
       <w:r>
         <w:rPr>
-          <w:rFonts w:ascii="Noto Sans KR" w:hAnsi="Noto Sans KR" w:eastAsia="Noto Sans KR"/>
-          <w:sz w:val="20"/>
+          <w:rFonts w:ascii="Malgun Gothic" w:hAnsi="Malgun Gothic" w:eastAsia="Malgun Gothic"/>
+          <w:b w:val="0"/>
+          <w:sz w:val="19"/>
         </w:rPr>
-        <w:t>상태 카드로 보여준다.</w:t>
+        <w:t>가족 여행 추천에는 유아숲체험원, 산림교육센터, 휴양림·수목원을 묶어 체험·숙박·산책 필터를 제공한다.</w:t>
       </w:r>
     </w:p>
     <w:p>
+      <w:pPr>
+        <w:pStyle w:val="ListBullet"/>
+        <w:spacing w:line="283" w:lineRule="auto" w:after="60"/>
+      </w:pPr>
       <w:r>
         <w:rPr>
-          <w:rFonts w:ascii="Noto Sans KR" w:hAnsi="Noto Sans KR" w:eastAsia="Noto Sans KR"/>
-          <w:sz w:val="20"/>
+          <w:rFonts w:ascii="Malgun Gothic" w:hAnsi="Malgun Gothic" w:eastAsia="Malgun Gothic"/>
+          <w:b w:val="0"/>
+          <w:sz w:val="19"/>
         </w:rPr>
-        <w:t>3. 숲길·등산로 geometry는 경로 탐색용이 아니라 참고용으로 먼저 노출한다. 원천</w:t>
+        <w:t>산불·산사태 데이터는 확인 필요, 주의, 경보처럼 행동을 유도하는 문구로 표시한다.</w:t>
       </w:r>
     </w:p>
     <w:p>
+      <w:pPr>
+        <w:pStyle w:val="ListBullet"/>
+        <w:spacing w:line="283" w:lineRule="auto" w:after="60"/>
+      </w:pPr>
       <w:r>
         <w:rPr>
-          <w:rFonts w:ascii="Noto Sans KR" w:hAnsi="Noto Sans KR" w:eastAsia="Noto Sans KR"/>
-          <w:sz w:val="20"/>
+          <w:rFonts w:ascii="Malgun Gothic" w:hAnsi="Malgun Gothic" w:eastAsia="Malgun Gothic"/>
+          <w:b w:val="0"/>
+          <w:sz w:val="19"/>
         </w:rPr>
-        <w:t>데이터의 정확도와 갱신주기가 일정하지 않을 수 있으므로 내비게이션 대체 문구는</w:t>
-      </w:r>
-    </w:p>
-    <w:p>
-      <w:r>
-        <w:rPr>
-          <w:rFonts w:ascii="Noto Sans KR" w:hAnsi="Noto Sans KR" w:eastAsia="Noto Sans KR"/>
-          <w:sz w:val="20"/>
-        </w:rPr>
-        <w:t>피한다.</w:t>
-      </w:r>
-    </w:p>
-    <w:p>
-      <w:r>
-        <w:rPr>
-          <w:rFonts w:ascii="Noto Sans KR" w:hAnsi="Noto Sans KR" w:eastAsia="Noto Sans KR"/>
-          <w:sz w:val="20"/>
-        </w:rPr>
-        <w:t>4. 가족 여행 추천에는 유아숲체험원, 산림교육센터, 휴양림·수목원을 묶어</w:t>
-      </w:r>
-    </w:p>
-    <w:p>
-      <w:r>
-        <w:rPr>
-          <w:rFonts w:ascii="Noto Sans KR" w:hAnsi="Noto Sans KR" w:eastAsia="Noto Sans KR"/>
-          <w:sz w:val="20"/>
-        </w:rPr>
-        <w:t>체험/숙박/산책 필터를 제공한다.</w:t>
-      </w:r>
-    </w:p>
-    <w:p>
-      <w:r>
-        <w:rPr>
-          <w:rFonts w:ascii="Noto Sans KR" w:hAnsi="Noto Sans KR" w:eastAsia="Noto Sans KR"/>
-          <w:sz w:val="20"/>
-        </w:rPr>
-        <w:t>5. 산불·산사태 데이터는 위험을 과장하지 않고 확인 필요, 주의, 경보처럼</w:t>
-      </w:r>
-    </w:p>
-    <w:p>
-      <w:r>
-        <w:rPr>
-          <w:rFonts w:ascii="Noto Sans KR" w:hAnsi="Noto Sans KR" w:eastAsia="Noto Sans KR"/>
-          <w:sz w:val="20"/>
-        </w:rPr>
-        <w:t>행동을 유도하는 문구로 표시한다.</w:t>
-      </w:r>
-    </w:p>
-    <w:p>
-      <w:r>
-        <w:rPr>
-          <w:rFonts w:ascii="Noto Sans KR" w:hAnsi="Noto Sans KR" w:eastAsia="Noto Sans KR"/>
-          <w:sz w:val="20"/>
-        </w:rPr>
-        <w:t>6. 래스터형 산사태위험지도는 앱 서버에서 타일 또는 요약 폴리곤으로 전처리한 뒤</w:t>
-      </w:r>
-    </w:p>
-    <w:p>
-      <w:r>
-        <w:rPr>
-          <w:rFonts w:ascii="Noto Sans KR" w:hAnsi="Noto Sans KR" w:eastAsia="Noto Sans KR"/>
-          <w:sz w:val="20"/>
-        </w:rPr>
-        <w:t>내려주는 구조가 적절하다. 클라이언트가 원본 TIF를 직접 다루는 방식은 피한다.</w:t>
+        <w:t>산사태위험지도는 서버에서 타일 또는 요약 레이어로 전처리한 뒤 제공하는 구조가 적합하다.</w:t>
       </w:r>
     </w:p>
     <w:p>
       <w:pPr>
         <w:pStyle w:val="Heading1"/>
+        <w:spacing w:before="240" w:after="100"/>
       </w:pPr>
       <w:r>
+        <w:rPr>
+          <w:rFonts w:ascii="Malgun Gothic" w:hAnsi="Malgun Gothic" w:eastAsia="Malgun Gothic"/>
+          <w:b/>
+          <w:color w:val="1F4E3D"/>
+          <w:sz w:val="30"/>
+        </w:rPr>
         <w:t>구현 반영 사항</w:t>
       </w:r>
     </w:p>
     <w:p>
       <w:pPr>
         <w:pStyle w:val="ListBullet"/>
+        <w:spacing w:line="283" w:lineRule="auto" w:after="60"/>
       </w:pPr>
       <w:r>
         <w:rPr>
-          <w:rFonts w:ascii="Noto Sans KR" w:hAnsi="Noto Sans KR" w:eastAsia="Noto Sans KR"/>
-          <w:sz w:val="20"/>
+          <w:rFonts w:ascii="Malgun Gothic" w:hAnsi="Malgun Gothic" w:eastAsia="Malgun Gothic"/>
+          <w:b w:val="0"/>
+          <w:sz w:val="19"/>
         </w:rPr>
-        <w:t>15084696 산악기상정보는 이미 구현되어 있었고, 이번 검토에서 문서와 live test</w:t>
-      </w:r>
-    </w:p>
-    <w:p>
-      <w:r>
-        <w:rPr>
-          <w:rFonts w:ascii="Noto Sans KR" w:hAnsi="Noto Sans KR" w:eastAsia="Noto Sans KR"/>
-          <w:sz w:val="20"/>
-        </w:rPr>
-        <w:t>대상에 다시 고정했다.</w:t>
+        <w:t>15084696 산악기상정보는 구현되어 있으며 live test 대상에 포함되어 있다.</w:t>
       </w:r>
     </w:p>
     <w:p>
       <w:pPr>
         <w:pStyle w:val="ListBullet"/>
+        <w:spacing w:line="283" w:lineRule="auto" w:after="60"/>
       </w:pPr>
       <w:r>
         <w:rPr>
-          <w:rFonts w:ascii="Noto Sans KR" w:hAnsi="Noto Sans KR" w:eastAsia="Noto Sans KR"/>
-          <w:sz w:val="20"/>
+          <w:rFonts w:ascii="Malgun Gothic" w:hAnsi="Malgun Gothic" w:eastAsia="Malgun Gothic"/>
+          <w:b w:val="0"/>
+          <w:sz w:val="19"/>
         </w:rPr>
-        <w:t>forest.go.kr 산림복지 다운로드 항목 중 등산로정보, 숲길정보, 산림교육센터 현황,</w:t>
-      </w:r>
-    </w:p>
-    <w:p>
-      <w:r>
-        <w:rPr>
-          <w:rFonts w:ascii="Noto Sans KR" w:hAnsi="Noto Sans KR" w:eastAsia="Noto Sans KR"/>
-          <w:sz w:val="20"/>
-        </w:rPr>
-        <w:t>유아숲체험원 현황, 전통마을숲 위치도, 휴양림·수목원 위치도를 직접 ZIP 다운로드</w:t>
-      </w:r>
-    </w:p>
-    <w:p>
-      <w:r>
-        <w:rPr>
-          <w:rFonts w:ascii="Noto Sans KR" w:hAnsi="Noto Sans KR" w:eastAsia="Noto Sans KR"/>
-          <w:sz w:val="20"/>
-        </w:rPr>
-        <w:t>대상으로 정리했다.</w:t>
+        <w:t>forest.go.kr 산림복지 다운로드 항목은 등산로정보, 둘레길정보, 산림교육센터, 유아숲체험원, 전통마을숲, 휴양림수목원 위치도를 포함한다.</w:t>
       </w:r>
     </w:p>
     <w:p>
       <w:pPr>
         <w:pStyle w:val="ListBullet"/>
+        <w:spacing w:line="283" w:lineRule="auto" w:after="60"/>
       </w:pPr>
       <w:r>
         <w:rPr>
-          <w:rFonts w:ascii="Noto Sans KR" w:hAnsi="Noto Sans KR" w:eastAsia="Noto Sans KR"/>
-          <w:sz w:val="20"/>
+          <w:rFonts w:ascii="Malgun Gothic" w:hAnsi="Malgun Gothic" w:eastAsia="Malgun Gothic"/>
+          <w:b w:val="0"/>
+          <w:sz w:val="19"/>
         </w:rPr>
         <w:t>forest.go.kr 산림재난 다운로드 항목 중 산사태위험지도 ZIP을 추가했다.</w:t>
       </w:r>
@@ -1209,150 +1498,127 @@
     <w:p>
       <w:pPr>
         <w:pStyle w:val="ListBullet"/>
+        <w:spacing w:line="283" w:lineRule="auto" w:after="60"/>
       </w:pPr>
       <w:r>
         <w:rPr>
-          <w:rFonts w:ascii="Noto Sans KR" w:hAnsi="Noto Sans KR" w:eastAsia="Noto Sans KR"/>
-          <w:sz w:val="20"/>
+          <w:rFonts w:ascii="Malgun Gothic" w:hAnsi="Malgun Gothic" w:eastAsia="Malgun Gothic"/>
+          <w:b w:val="0"/>
+          <w:sz w:val="19"/>
         </w:rPr>
-        <w:t>SHP/GeoJSON/GPX처럼 record-shaped vector로 읽을 수 있는 파일은</w:t>
+        <w:t>vector 파일은 ForestSpatialFeature 또는 ForestSpatialPoint로 반환하고, raster ZIP은 파일명 key를 갖는 dict[str, bytes]로 반환한다.</w:t>
       </w:r>
     </w:p>
     <w:p>
+      <w:pPr>
+        <w:pStyle w:val="ListBullet"/>
+        <w:spacing w:line="283" w:lineRule="auto" w:after="60"/>
+      </w:pPr>
       <w:r>
         <w:rPr>
-          <w:rFonts w:ascii="Noto Sans KR" w:hAnsi="Noto Sans KR" w:eastAsia="Noto Sans KR"/>
-          <w:sz w:val="20"/>
+          <w:rFonts w:ascii="Malgun Gothic" w:hAnsi="Malgun Gothic" w:eastAsia="Malgun Gothic"/>
+          <w:b w:val="0"/>
+          <w:sz w:val="19"/>
         </w:rPr>
-        <w:t>ForestSpatialFeature 또는 ForestSpatialPoint로 반환하고, 산사태위험지도처럼</w:t>
-      </w:r>
-    </w:p>
-    <w:p>
-      <w:r>
-        <w:rPr>
-          <w:rFonts w:ascii="Noto Sans KR" w:hAnsi="Noto Sans KR" w:eastAsia="Noto Sans KR"/>
-          <w:sz w:val="20"/>
-        </w:rPr>
-        <w:t>TIF/XML/PDF로 구성된 래스터 ZIP은 파일명 key를 갖는 dict[str, bytes]로 반환한다.</w:t>
+        <w:t>클라이언트 API는 ForestClient(api_key=...), ForestClient.from_env(), async with, travel... 형태로 정리했다.</w:t>
       </w:r>
     </w:p>
     <w:p>
       <w:pPr>
         <w:pStyle w:val="Heading1"/>
+        <w:spacing w:before="240" w:after="100"/>
       </w:pPr>
       <w:r>
+        <w:rPr>
+          <w:rFonts w:ascii="Malgun Gothic" w:hAnsi="Malgun Gothic" w:eastAsia="Malgun Gothic"/>
+          <w:b/>
+          <w:color w:val="1F4E3D"/>
+          <w:sz w:val="30"/>
+        </w:rPr>
         <w:t>운영 주의사항</w:t>
       </w:r>
     </w:p>
     <w:p>
       <w:pPr>
         <w:pStyle w:val="ListBullet"/>
+        <w:spacing w:line="283" w:lineRule="auto" w:after="60"/>
       </w:pPr>
       <w:r>
         <w:rPr>
-          <w:rFonts w:ascii="Noto Sans KR" w:hAnsi="Noto Sans KR" w:eastAsia="Noto Sans KR"/>
-          <w:sz w:val="20"/>
+          <w:rFonts w:ascii="Malgun Gothic" w:hAnsi="Malgun Gothic" w:eastAsia="Malgun Gothic"/>
+          <w:b w:val="0"/>
+          <w:sz w:val="19"/>
         </w:rPr>
-        <w:t>data.go.kr apis.data.go.kr/1400000과 1400377 일부 endpoint는 서비스 키별</w:t>
-      </w:r>
-    </w:p>
-    <w:p>
-      <w:r>
-        <w:rPr>
-          <w:rFonts w:ascii="Noto Sans KR" w:hAnsi="Noto Sans KR" w:eastAsia="Noto Sans KR"/>
-          <w:sz w:val="20"/>
-        </w:rPr>
-        <w:t>활용신청 상태에 따라 HTTP 403을 반환할 수 있다. 앱에서는 승인 필요 상태와</w:t>
-      </w:r>
-    </w:p>
-    <w:p>
-      <w:r>
-        <w:rPr>
-          <w:rFonts w:ascii="Noto Sans KR" w:hAnsi="Noto Sans KR" w:eastAsia="Noto Sans KR"/>
-          <w:sz w:val="20"/>
-        </w:rPr>
-        <w:t>장애를 구분해야 한다.</w:t>
+        <w:t>data.go.kr 1400000 및 1400377 일부 endpoint는 서비스별 활용신청 상태에 따라 HTTP 403을 반환할 수 있다.</w:t>
       </w:r>
     </w:p>
     <w:p>
       <w:pPr>
         <w:pStyle w:val="ListBullet"/>
+        <w:spacing w:line="283" w:lineRule="auto" w:after="60"/>
       </w:pPr>
       <w:r>
         <w:rPr>
-          <w:rFonts w:ascii="Noto Sans KR" w:hAnsi="Noto Sans KR" w:eastAsia="Noto Sans KR"/>
-          <w:sz w:val="20"/>
+          <w:rFonts w:ascii="Malgun Gothic" w:hAnsi="Malgun Gothic" w:eastAsia="Malgun Gothic"/>
+          <w:b w:val="0"/>
+          <w:sz w:val="19"/>
         </w:rPr>
-        <w:t>산악기상은 실시간 데이터지만 관측 지점이 제한적이다. 산 전체 날씨처럼 표현하지</w:t>
-      </w:r>
-    </w:p>
-    <w:p>
-      <w:r>
-        <w:rPr>
-          <w:rFonts w:ascii="Noto Sans KR" w:hAnsi="Noto Sans KR" w:eastAsia="Noto Sans KR"/>
-          <w:sz w:val="20"/>
-        </w:rPr>
-        <w:t>말고, 관측 지점 기준 정보임을 UI에 드러낸다.</w:t>
+        <w:t>산악기상은 관측 지점 기준 정보이며 특정 산 전체의 안전 판정처럼 표현하지 않는다.</w:t>
       </w:r>
     </w:p>
     <w:p>
       <w:pPr>
         <w:pStyle w:val="ListBullet"/>
+        <w:spacing w:line="283" w:lineRule="auto" w:after="60"/>
       </w:pPr>
       <w:r>
         <w:rPr>
-          <w:rFonts w:ascii="Noto Sans KR" w:hAnsi="Noto Sans KR" w:eastAsia="Noto Sans KR"/>
-          <w:sz w:val="20"/>
+          <w:rFonts w:ascii="Malgun Gothic" w:hAnsi="Malgun Gothic" w:eastAsia="Malgun Gothic"/>
+          <w:b w:val="0"/>
+          <w:sz w:val="19"/>
         </w:rPr>
-        <w:t>산사태위험지도는 대용량 래스터 파일이므로 원본을 모바일 앱에 직접 내려주지</w:t>
-      </w:r>
-    </w:p>
-    <w:p>
-      <w:r>
-        <w:rPr>
-          <w:rFonts w:ascii="Noto Sans KR" w:hAnsi="Noto Sans KR" w:eastAsia="Noto Sans KR"/>
-          <w:sz w:val="20"/>
-        </w:rPr>
-        <w:t>않는다.</w:t>
+        <w:t>산사태위험지도 원본은 대용량 raster 파일이므로 모바일 앱에 직접 내려주지 않는다.</w:t>
       </w:r>
     </w:p>
     <w:p>
       <w:pPr>
         <w:pStyle w:val="ListBullet"/>
+        <w:spacing w:line="283" w:lineRule="auto" w:after="60"/>
       </w:pPr>
       <w:r>
         <w:rPr>
-          <w:rFonts w:ascii="Noto Sans KR" w:hAnsi="Noto Sans KR" w:eastAsia="Noto Sans KR"/>
-          <w:sz w:val="20"/>
+          <w:rFonts w:ascii="Malgun Gothic" w:hAnsi="Malgun Gothic" w:eastAsia="Malgun Gothic"/>
+          <w:b w:val="0"/>
+          <w:sz w:val="19"/>
         </w:rPr>
-        <w:t>파일데이터 다운로드 결과는 갱신일을 추적하고, 캐시 갱신 실패 시 이전 데이터와</w:t>
-      </w:r>
-    </w:p>
-    <w:p>
-      <w:r>
-        <w:rPr>
-          <w:rFonts w:ascii="Noto Sans KR" w:hAnsi="Noto Sans KR" w:eastAsia="Noto Sans KR"/>
-          <w:sz w:val="20"/>
-        </w:rPr>
-        <w:t>최신성 문구를 함께 보여준다.</w:t>
+        <w:t>파일데이터 다운로드 결과의 갱신일을 추적하고 캐시 갱신 실패 시 데이터 최신성 문구를 함께 보여준다.</w:t>
       </w:r>
     </w:p>
     <w:p>
       <w:pPr>
         <w:pStyle w:val="Heading1"/>
+        <w:spacing w:before="240" w:after="100"/>
       </w:pPr>
       <w:r>
+        <w:rPr>
+          <w:rFonts w:ascii="Malgun Gothic" w:hAnsi="Malgun Gothic" w:eastAsia="Malgun Gothic"/>
+          <w:b/>
+          <w:color w:val="1F4E3D"/>
+          <w:sz w:val="30"/>
+        </w:rPr>
         <w:t>참고 URL</w:t>
       </w:r>
     </w:p>
     <w:p>
       <w:pPr>
         <w:pStyle w:val="ListBullet"/>
+        <w:spacing w:line="283" w:lineRule="auto" w:after="60"/>
       </w:pPr>
       <w:r>
         <w:rPr>
-          <w:rFonts w:ascii="Noto Sans KR" w:hAnsi="Noto Sans KR" w:eastAsia="Noto Sans KR"/>
-          <w:sz w:val="20"/>
+          <w:rFonts w:ascii="Malgun Gothic" w:hAnsi="Malgun Gothic" w:eastAsia="Malgun Gothic"/>
+          <w:b w:val="0"/>
+          <w:sz w:val="19"/>
         </w:rPr>
         <w:t>https://www.data.go.kr/data/15084696/openapi.do</w:t>
       </w:r>
@@ -1360,11 +1626,13 @@
     <w:p>
       <w:pPr>
         <w:pStyle w:val="ListBullet"/>
+        <w:spacing w:line="283" w:lineRule="auto" w:after="60"/>
       </w:pPr>
       <w:r>
         <w:rPr>
-          <w:rFonts w:ascii="Noto Sans KR" w:hAnsi="Noto Sans KR" w:eastAsia="Noto Sans KR"/>
-          <w:sz w:val="20"/>
+          <w:rFonts w:ascii="Malgun Gothic" w:hAnsi="Malgun Gothic" w:eastAsia="Malgun Gothic"/>
+          <w:b w:val="0"/>
+          <w:sz w:val="19"/>
         </w:rPr>
         <w:t>https://www.forest.go.kr/kfsweb/opda/dataMng/selectPblicDataList.do?mn=NKFS_06_08_02&amp;tabs=3</w:t>
       </w:r>
@@ -1372,23 +1640,46 @@
     <w:p>
       <w:pPr>
         <w:pStyle w:val="ListBullet"/>
+        <w:spacing w:line="283" w:lineRule="auto" w:after="60"/>
       </w:pPr>
       <w:r>
         <w:rPr>
-          <w:rFonts w:ascii="Noto Sans KR" w:hAnsi="Noto Sans KR" w:eastAsia="Noto Sans KR"/>
-          <w:sz w:val="20"/>
+          <w:rFonts w:ascii="Malgun Gothic" w:hAnsi="Malgun Gothic" w:eastAsia="Malgun Gothic"/>
+          <w:b w:val="0"/>
+          <w:sz w:val="19"/>
         </w:rPr>
         <w:t>https://www.forest.go.kr/kfsweb/opda/dataMng/selectPblicDataList.do?mn=NKFS_06_08_02&amp;tabs=4</w:t>
       </w:r>
     </w:p>
     <w:sectPr>
+      <w:footerReference w:type="default" r:id="rId9"/>
       <w:pgSz w:w="12240" w:h="15840"/>
-      <w:pgMar w:top="1008" w:right="1008" w:bottom="1008" w:left="1008" w:header="720" w:footer="720" w:gutter="0"/>
+      <w:pgMar w:top="964" w:right="992" w:bottom="907" w:left="992" w:header="720" w:footer="720" w:gutter="0"/>
       <w:cols w:space="720"/>
       <w:docGrid w:linePitch="360"/>
     </w:sectPr>
   </w:body>
 </w:document>
+</file>
+
+<file path=word/footer1.xml><?xml version="1.0" encoding="utf-8"?>
+<w:ftr xmlns:m="http://schemas.openxmlformats.org/officeDocument/2006/math" xmlns:mc="http://schemas.openxmlformats.org/markup-compatibility/2006" xmlns:mo="http://schemas.microsoft.com/office/mac/office/2008/main" xmlns:mv="urn:schemas-microsoft-com:mac:vml" xmlns:o="urn:schemas-microsoft-com:office:office" xmlns:r="http://schemas.openxmlformats.org/officeDocument/2006/relationships" xmlns:v="urn:schemas-microsoft-com:vml" xmlns:w10="urn:schemas-microsoft-com:office:word" xmlns:w14="http://schemas.microsoft.com/office/word/2010/wordml" xmlns:w="http://schemas.openxmlformats.org/wordprocessingml/2006/main" xmlns:wne="http://schemas.microsoft.com/office/word/2006/wordml" xmlns:wp14="http://schemas.microsoft.com/office/word/2010/wordprocessingDrawing" xmlns:wp="http://schemas.openxmlformats.org/drawingml/2006/wordprocessingDrawing" xmlns:wpc="http://schemas.microsoft.com/office/word/2010/wordprocessingCanvas" xmlns:wpg="http://schemas.microsoft.com/office/word/2010/wordprocessingGroup" xmlns:wpi="http://schemas.microsoft.com/office/word/2010/wordprocessingInk" xmlns:wps="http://schemas.microsoft.com/office/word/2010/wordprocessingShape" mc:Ignorable="w14 wp14">
+  <w:p>
+    <w:pPr>
+      <w:pStyle w:val="Footer"/>
+      <w:jc w:val="center"/>
+    </w:pPr>
+    <w:r>
+      <w:rPr>
+        <w:rFonts w:ascii="Malgun Gothic" w:hAnsi="Malgun Gothic" w:eastAsia="Malgun Gothic"/>
+        <w:b w:val="0"/>
+        <w:color w:val="787878"/>
+        <w:sz w:val="16"/>
+      </w:rPr>
+      <w:t>python-krforest-api / TripMate 산림복지·산림재난 데이터 메모</w:t>
+    </w:r>
+  </w:p>
+</w:ftr>
 </file>
 
 <file path=word/numbering.xml><?xml version="1.0" encoding="utf-8"?>
@@ -1755,7 +2046,7 @@
     <w:qFormat/>
     <w:rsid w:val="00FC693F"/>
     <w:rPr>
-      <w:rFonts w:ascii="Noto Sans KR" w:hAnsi="Noto Sans KR" w:eastAsia="Noto Sans KR"/>
+      <w:rFonts w:ascii="Malgun Gothic" w:hAnsi="Malgun Gothic" w:eastAsia="Malgun Gothic"/>
       <w:sz w:val="20"/>
     </w:rPr>
   </w:style>
@@ -1818,10 +2109,10 @@
       <w:outlineLvl w:val="0"/>
     </w:pPr>
     <w:rPr>
-      <w:rFonts w:asciiTheme="majorHAnsi" w:eastAsiaTheme="majorEastAsia" w:hAnsiTheme="majorHAnsi" w:cstheme="majorBidi" w:ascii="Noto Sans KR" w:hAnsi="Noto Sans KR" w:eastAsia="Noto Sans KR"/>
+      <w:rFonts w:asciiTheme="majorHAnsi" w:eastAsiaTheme="majorEastAsia" w:hAnsiTheme="majorHAnsi" w:cstheme="majorBidi"/>
       <w:b/>
       <w:bCs/>
-      <w:color w:val="1F4E40"/>
+      <w:color w:val="365F91" w:themeColor="accent1" w:themeShade="BF"/>
       <w:sz w:val="28"/>
       <w:szCs w:val="28"/>
     </w:rPr>
@@ -1842,10 +2133,10 @@
       <w:outlineLvl w:val="1"/>
     </w:pPr>
     <w:rPr>
-      <w:rFonts w:asciiTheme="majorHAnsi" w:eastAsiaTheme="majorEastAsia" w:hAnsiTheme="majorHAnsi" w:cstheme="majorBidi" w:ascii="Noto Sans KR" w:hAnsi="Noto Sans KR" w:eastAsia="Noto Sans KR"/>
+      <w:rFonts w:asciiTheme="majorHAnsi" w:eastAsiaTheme="majorEastAsia" w:hAnsiTheme="majorHAnsi" w:cstheme="majorBidi"/>
       <w:b/>
       <w:bCs/>
-      <w:color w:val="1F4E40"/>
+      <w:color w:val="4F81BD" w:themeColor="accent1"/>
       <w:sz w:val="26"/>
       <w:szCs w:val="26"/>
     </w:rPr>
@@ -1866,10 +2157,10 @@
       <w:outlineLvl w:val="2"/>
     </w:pPr>
     <w:rPr>
-      <w:rFonts w:asciiTheme="majorHAnsi" w:eastAsiaTheme="majorEastAsia" w:hAnsiTheme="majorHAnsi" w:cstheme="majorBidi" w:ascii="Noto Sans KR" w:hAnsi="Noto Sans KR" w:eastAsia="Noto Sans KR"/>
+      <w:rFonts w:asciiTheme="majorHAnsi" w:eastAsiaTheme="majorEastAsia" w:hAnsiTheme="majorHAnsi" w:cstheme="majorBidi"/>
       <w:b/>
       <w:bCs/>
-      <w:color w:val="1F4E40"/>
+      <w:color w:val="4F81BD" w:themeColor="accent1"/>
     </w:rPr>
   </w:style>
   <w:style w:type="paragraph" w:styleId="Heading4">
@@ -2287,9 +2578,6 @@
       </w:numPr>
       <w:contextualSpacing/>
     </w:pPr>
-    <w:rPr>
-      <w:rFonts w:ascii="Noto Sans KR" w:hAnsi="Noto Sans KR" w:eastAsia="Noto Sans KR"/>
-    </w:rPr>
   </w:style>
   <w:style w:type="paragraph" w:styleId="ListBullet2">
     <w:name w:val="List Bullet 2"/>

</xml_diff>